<commit_message>
Visual upgrades for figures
</commit_message>
<xml_diff>
--- a/Cicles/Segundo Ciclo/docs/Segundo ciclo.docx
+++ b/Cicles/Segundo Ciclo/docs/Segundo ciclo.docx
@@ -179,18 +179,8 @@
           <w:color w:val="000000" w:themeColor="text1"/>
           <w:lang w:val="es-CO"/>
         </w:rPr>
-        <w:t xml:space="preserve">David Santiago Garzon </w:t>
-      </w:r>
-      <w:proofErr w:type="spellStart"/>
-      <w:r>
-        <w:rPr>
-          <w:rFonts w:ascii="Times New Roman" w:eastAsia="Times New Roman" w:hAnsi="Times New Roman" w:cs="Times New Roman"/>
-          <w:color w:val="000000" w:themeColor="text1"/>
-          <w:lang w:val="es-CO"/>
-        </w:rPr>
-        <w:t>Rodriguez</w:t>
-      </w:r>
-      <w:proofErr w:type="spellEnd"/>
+        <w:t>David Santiago Garzon Rodriguez</w:t>
+      </w:r>
     </w:p>
     <w:p>
       <w:pPr>
@@ -349,21 +339,7 @@
         <w:rPr>
           <w:lang w:val="es-CO"/>
         </w:rPr>
-        <w:t xml:space="preserve">Antes de iniciar con los </w:t>
-      </w:r>
-      <w:proofErr w:type="spellStart"/>
-      <w:r>
-        <w:rPr>
-          <w:lang w:val="es-CO"/>
-        </w:rPr>
-        <w:t>miniCiclos</w:t>
-      </w:r>
-      <w:proofErr w:type="spellEnd"/>
-      <w:r>
-        <w:rPr>
-          <w:lang w:val="es-CO"/>
-        </w:rPr>
-        <w:t xml:space="preserve"> que pide el Ciclo2, vemos viable refactorizar un poco el código para lograr los siguientes objetivos:</w:t>
+        <w:t>Antes de iniciar con los miniCiclos que pide el Ciclo2, vemos viable refactorizar un poco el código para lograr los siguientes objetivos:</w:t>
       </w:r>
     </w:p>
     <w:p>
@@ -385,15 +361,7 @@
         <w:t xml:space="preserve">Si hay más de cierta cantidad de ruedas, las siguientes ruedas se posicionan debajo </w:t>
       </w:r>
       <w:r>
-        <w:t xml:space="preserve">y el tamaño de la </w:t>
-      </w:r>
-      <w:proofErr w:type="spellStart"/>
-      <w:r>
-        <w:t>slotMachine</w:t>
-      </w:r>
-      <w:proofErr w:type="spellEnd"/>
-      <w:r>
-        <w:t xml:space="preserve"> crece para permitir poner más ruedas</w:t>
+        <w:t>y el tamaño de la slotMachine crece para permitir poner más ruedas</w:t>
       </w:r>
       <w:r>
         <w:t>.</w:t>
@@ -414,19 +382,8 @@
     <w:p>
       <w:pPr>
         <w:pStyle w:val="Prrafodelista"/>
-        <w:numPr>
-          <w:ilvl w:val="0"/>
-          <w:numId w:val="1"/>
-        </w:numPr>
-      </w:pPr>
-      <w:r>
-        <w:t xml:space="preserve">Nueva animación de </w:t>
-      </w:r>
-      <w:r>
-        <w:t>victoria.</w:t>
-      </w:r>
-    </w:p>
-    <w:p/>
+      </w:pPr>
+    </w:p>
     <w:p>
       <w:pPr>
         <w:pStyle w:val="Prrafodelista"/>
@@ -436,15 +393,7 @@
         </w:numPr>
       </w:pPr>
       <w:r>
-        <w:t xml:space="preserve">Se le añadió una base negra a la </w:t>
-      </w:r>
-      <w:proofErr w:type="spellStart"/>
-      <w:r>
-        <w:t>SlotMachine</w:t>
-      </w:r>
-      <w:proofErr w:type="spellEnd"/>
-      <w:r>
-        <w:t>:</w:t>
+        <w:t>Se le añadió una base negra a la SlotMachine:</w:t>
       </w:r>
     </w:p>
     <w:p>
@@ -556,15 +505,7 @@
         </w:numPr>
       </w:pPr>
       <w:r>
-        <w:t xml:space="preserve">Actualmente este es el limite de la </w:t>
-      </w:r>
-      <w:proofErr w:type="spellStart"/>
-      <w:r>
-        <w:t>slotMachine</w:t>
-      </w:r>
-      <w:proofErr w:type="spellEnd"/>
-      <w:r>
-        <w:t xml:space="preserve"> sin que se salga de la ventana:</w:t>
+        <w:t>Actualmente este es el limite de la slotMachine sin que se salga de la ventana:</w:t>
       </w:r>
     </w:p>
     <w:p>
@@ -671,15 +612,7 @@
         <w:pStyle w:val="Prrafodelista"/>
       </w:pPr>
       <w:r>
-        <w:t xml:space="preserve">En este caso se ven las 50 entradas máximas que debería poder tener la </w:t>
-      </w:r>
-      <w:proofErr w:type="spellStart"/>
-      <w:r>
-        <w:t>maquina</w:t>
-      </w:r>
-      <w:proofErr w:type="spellEnd"/>
-      <w:r>
-        <w:t>.</w:t>
+        <w:t>En este caso se ven las 50 entradas máximas que debería poder tener la maquina.</w:t>
       </w:r>
     </w:p>
     <w:p>
@@ -700,11 +633,124 @@
         <w:lastRenderedPageBreak/>
         <w:t xml:space="preserve">Para el tema de los símbolos, es necesario refactorizar varias partes del código, la primera, es necesario crear </w:t>
       </w:r>
+      <w:r>
+        <w:t xml:space="preserve">una herencia de </w:t>
+      </w:r>
+      <w:r>
+        <w:t>las diferentes figuras de shape:</w:t>
+      </w:r>
     </w:p>
     <w:p>
       <w:pPr>
         <w:pStyle w:val="Prrafodelista"/>
       </w:pPr>
+      <w:r>
+        <w:drawing>
+          <wp:inline distT="0" distB="0" distL="0" distR="0" wp14:anchorId="657BE5CE" wp14:editId="0EF3D918">
+            <wp:extent cx="5612130" cy="4411980"/>
+            <wp:effectExtent l="0" t="0" r="7620" b="7620"/>
+            <wp:docPr id="242551655" name="Imagen 1"/>
+            <wp:cNvGraphicFramePr>
+              <a:graphicFrameLocks xmlns:a="http://schemas.openxmlformats.org/drawingml/2006/main" noChangeAspect="1"/>
+            </wp:cNvGraphicFramePr>
+            <a:graphic xmlns:a="http://schemas.openxmlformats.org/drawingml/2006/main">
+              <a:graphicData uri="http://schemas.openxmlformats.org/drawingml/2006/picture">
+                <pic:pic xmlns:pic="http://schemas.openxmlformats.org/drawingml/2006/picture">
+                  <pic:nvPicPr>
+                    <pic:cNvPr id="242551655" name=""/>
+                    <pic:cNvPicPr/>
+                  </pic:nvPicPr>
+                  <pic:blipFill>
+                    <a:blip r:embed="rId9"/>
+                    <a:stretch>
+                      <a:fillRect/>
+                    </a:stretch>
+                  </pic:blipFill>
+                  <pic:spPr>
+                    <a:xfrm>
+                      <a:off x="0" y="0"/>
+                      <a:ext cx="5612130" cy="4411980"/>
+                    </a:xfrm>
+                    <a:prstGeom prst="rect">
+                      <a:avLst/>
+                    </a:prstGeom>
+                  </pic:spPr>
+                </pic:pic>
+              </a:graphicData>
+            </a:graphic>
+          </wp:inline>
+        </w:drawing>
+      </w:r>
+    </w:p>
+    <w:p>
+      <w:pPr>
+        <w:pStyle w:val="Prrafodelista"/>
+      </w:pPr>
+      <w:r>
+        <w:t xml:space="preserve">Esto se traspasa a código, lo cual nos permitirá </w:t>
+      </w:r>
+      <w:r>
+        <w:t>hacer que el cuerpo del symbol ahora sea una figura, y ahora slotMachine tenga dentro de si diferentes Figures. El objetivo de que slotMachine tenga diferentes Figures es para que, cada ves que cree una rueda, le diga de que color es el símbolo y la forma del símbolo.</w:t>
+      </w:r>
+    </w:p>
+    <w:p>
+      <w:pPr>
+        <w:pStyle w:val="Prrafodelista"/>
+      </w:pPr>
+    </w:p>
+    <w:p>
+      <w:pPr>
+        <w:pStyle w:val="Prrafodelista"/>
+      </w:pPr>
+      <w:r>
+        <w:drawing>
+          <wp:inline distT="0" distB="0" distL="0" distR="0" wp14:anchorId="1748B9B3" wp14:editId="6C053ACC">
+            <wp:extent cx="5612130" cy="2007235"/>
+            <wp:effectExtent l="0" t="0" r="7620" b="0"/>
+            <wp:docPr id="850895739" name="Imagen 1"/>
+            <wp:cNvGraphicFramePr>
+              <a:graphicFrameLocks xmlns:a="http://schemas.openxmlformats.org/drawingml/2006/main" noChangeAspect="1"/>
+            </wp:cNvGraphicFramePr>
+            <a:graphic xmlns:a="http://schemas.openxmlformats.org/drawingml/2006/main">
+              <a:graphicData uri="http://schemas.openxmlformats.org/drawingml/2006/picture">
+                <pic:pic xmlns:pic="http://schemas.openxmlformats.org/drawingml/2006/picture">
+                  <pic:nvPicPr>
+                    <pic:cNvPr id="850895739" name=""/>
+                    <pic:cNvPicPr/>
+                  </pic:nvPicPr>
+                  <pic:blipFill>
+                    <a:blip r:embed="rId10"/>
+                    <a:stretch>
+                      <a:fillRect/>
+                    </a:stretch>
+                  </pic:blipFill>
+                  <pic:spPr>
+                    <a:xfrm>
+                      <a:off x="0" y="0"/>
+                      <a:ext cx="5612130" cy="2007235"/>
+                    </a:xfrm>
+                    <a:prstGeom prst="rect">
+                      <a:avLst/>
+                    </a:prstGeom>
+                  </pic:spPr>
+                </pic:pic>
+              </a:graphicData>
+            </a:graphic>
+          </wp:inline>
+        </w:drawing>
+      </w:r>
+    </w:p>
+    <w:p>
+      <w:pPr>
+        <w:pStyle w:val="Prrafodelista"/>
+      </w:pPr>
+      <w:r>
+        <w:lastRenderedPageBreak/>
+        <w:t xml:space="preserve">Después de añadir varias ruedas y </w:t>
+      </w:r>
+      <w:r>
+        <w:t>añadir varios colores de símbolos, ahí se puede apreciar el cambio, permitiendo que tenga un poco más de azar, al tener diferentes figuras dependiendo del color.</w:t>
+      </w:r>
     </w:p>
     <w:sectPr>
       <w:pgSz w:w="12240" w:h="15840"/>

</xml_diff>

<commit_message>
Finalización de la creación de los tests
</commit_message>
<xml_diff>
--- a/Cicles/Segundo Ciclo/docs/Segundo ciclo.docx
+++ b/Cicles/Segundo Ciclo/docs/Segundo ciclo.docx
@@ -179,18 +179,18 @@
           <w:color w:val="000000" w:themeColor="text1"/>
           <w:lang w:val="es-CO"/>
         </w:rPr>
-        <w:t xml:space="preserve">David Santiago Garzon </w:t>
-      </w:r>
-      <w:proofErr w:type="spellStart"/>
-      <w:r>
+        <w:t>David Santiago Garzon Rodriguez</w:t>
+      </w:r>
+    </w:p>
+    <w:p>
+      <w:pPr>
+        <w:jc w:val="center"/>
         <w:rPr>
           <w:rFonts w:ascii="Times New Roman" w:eastAsia="Times New Roman" w:hAnsi="Times New Roman" w:cs="Times New Roman"/>
           <w:color w:val="000000" w:themeColor="text1"/>
           <w:lang w:val="es-CO"/>
         </w:rPr>
-        <w:t>Rodriguez</w:t>
-      </w:r>
-      <w:proofErr w:type="spellEnd"/>
+      </w:pPr>
     </w:p>
     <w:p>
       <w:pPr>
@@ -211,51 +211,41 @@
           <w:lang w:val="es-CO"/>
         </w:rPr>
       </w:pPr>
-    </w:p>
-    <w:p>
-      <w:pPr>
-        <w:jc w:val="center"/>
+      <w:r>
         <w:rPr>
           <w:rFonts w:ascii="Times New Roman" w:eastAsia="Times New Roman" w:hAnsi="Times New Roman" w:cs="Times New Roman"/>
           <w:color w:val="000000" w:themeColor="text1"/>
           <w:lang w:val="es-CO"/>
         </w:rPr>
-      </w:pPr>
-      <w:r>
+        <w:t>Docente:</w:t>
+      </w:r>
+    </w:p>
+    <w:p>
+      <w:pPr>
+        <w:jc w:val="center"/>
         <w:rPr>
           <w:rFonts w:ascii="Times New Roman" w:eastAsia="Times New Roman" w:hAnsi="Times New Roman" w:cs="Times New Roman"/>
           <w:color w:val="000000" w:themeColor="text1"/>
           <w:lang w:val="es-CO"/>
         </w:rPr>
-        <w:t>Docente:</w:t>
-      </w:r>
-    </w:p>
-    <w:p>
-      <w:pPr>
-        <w:jc w:val="center"/>
+      </w:pPr>
+      <w:r>
         <w:rPr>
           <w:rFonts w:ascii="Times New Roman" w:eastAsia="Times New Roman" w:hAnsi="Times New Roman" w:cs="Times New Roman"/>
           <w:color w:val="000000" w:themeColor="text1"/>
           <w:lang w:val="es-CO"/>
         </w:rPr>
-      </w:pPr>
-      <w:r>
+        <w:t>María Irma Diaz Rozo</w:t>
+      </w:r>
+    </w:p>
+    <w:p>
+      <w:pPr>
+        <w:jc w:val="center"/>
         <w:rPr>
           <w:rFonts w:ascii="Times New Roman" w:eastAsia="Times New Roman" w:hAnsi="Times New Roman" w:cs="Times New Roman"/>
           <w:color w:val="000000" w:themeColor="text1"/>
           <w:lang w:val="es-CO"/>
         </w:rPr>
-        <w:t>María Irma Diaz Rozo</w:t>
-      </w:r>
-    </w:p>
-    <w:p>
-      <w:pPr>
-        <w:jc w:val="center"/>
-        <w:rPr>
-          <w:rFonts w:ascii="Times New Roman" w:eastAsia="Times New Roman" w:hAnsi="Times New Roman" w:cs="Times New Roman"/>
-          <w:color w:val="000000" w:themeColor="text1"/>
-          <w:lang w:val="es-CO"/>
-        </w:rPr>
       </w:pPr>
     </w:p>
     <w:p>
@@ -349,21 +339,7 @@
         <w:rPr>
           <w:lang w:val="es-CO"/>
         </w:rPr>
-        <w:t xml:space="preserve">Antes de iniciar con los </w:t>
-      </w:r>
-      <w:proofErr w:type="spellStart"/>
-      <w:r>
-        <w:rPr>
-          <w:lang w:val="es-CO"/>
-        </w:rPr>
-        <w:t>miniCiclos</w:t>
-      </w:r>
-      <w:proofErr w:type="spellEnd"/>
-      <w:r>
-        <w:rPr>
-          <w:lang w:val="es-CO"/>
-        </w:rPr>
-        <w:t xml:space="preserve"> que pide el Ciclo2, vemos viable refactorizar un poco el código para lograr los siguientes objetivos:</w:t>
+        <w:t>Antes de iniciar con los miniCiclos que pide el Ciclo2, vemos viable refactorizar un poco el código para lograr los siguientes objetivos:</w:t>
       </w:r>
     </w:p>
     <w:p>
@@ -385,15 +361,7 @@
         <w:t xml:space="preserve">Si hay más de cierta cantidad de ruedas, las siguientes ruedas se posicionan debajo </w:t>
       </w:r>
       <w:r>
-        <w:t xml:space="preserve">y el tamaño de la </w:t>
-      </w:r>
-      <w:proofErr w:type="spellStart"/>
-      <w:r>
-        <w:t>slotMachine</w:t>
-      </w:r>
-      <w:proofErr w:type="spellEnd"/>
-      <w:r>
-        <w:t xml:space="preserve"> crece para permitir poner más ruedas</w:t>
+        <w:t>y el tamaño de la slotMachine crece para permitir poner más ruedas</w:t>
       </w:r>
       <w:r>
         <w:t>.</w:t>
@@ -425,15 +393,7 @@
         </w:numPr>
       </w:pPr>
       <w:r>
-        <w:t xml:space="preserve">Se le añadió una base negra a la </w:t>
-      </w:r>
-      <w:proofErr w:type="spellStart"/>
-      <w:r>
-        <w:t>SlotMachine</w:t>
-      </w:r>
-      <w:proofErr w:type="spellEnd"/>
-      <w:r>
-        <w:t>:</w:t>
+        <w:t>Se le añadió una base negra a la SlotMachine:</w:t>
       </w:r>
     </w:p>
     <w:p>
@@ -551,23 +511,7 @@
         </w:numPr>
       </w:pPr>
       <w:r>
-        <w:t xml:space="preserve">Actualmente este es el </w:t>
-      </w:r>
-      <w:proofErr w:type="spellStart"/>
-      <w:r>
-        <w:t>limite</w:t>
-      </w:r>
-      <w:proofErr w:type="spellEnd"/>
-      <w:r>
-        <w:t xml:space="preserve"> de la </w:t>
-      </w:r>
-      <w:proofErr w:type="spellStart"/>
-      <w:r>
-        <w:t>slotMachine</w:t>
-      </w:r>
-      <w:proofErr w:type="spellEnd"/>
-      <w:r>
-        <w:t xml:space="preserve"> sin que se salga de la ventana:</w:t>
+        <w:t>Actualmente este es el limite de la slotMachine sin que se salga de la ventana:</w:t>
       </w:r>
     </w:p>
     <w:p>
@@ -624,15 +568,7 @@
         <w:t>Pero, en el enunciado original, se deberían poder tener hasta 50</w:t>
       </w:r>
       <w:r>
-        <w:t xml:space="preserve">, por </w:t>
-      </w:r>
-      <w:proofErr w:type="gramStart"/>
-      <w:r>
-        <w:t>tanto</w:t>
-      </w:r>
-      <w:proofErr w:type="gramEnd"/>
-      <w:r>
-        <w:t xml:space="preserve"> es necesario refactorizar buena parte del código para que todo siga funcionando correctamente y que se puedan añadir nuevas ruedas debajo</w:t>
+        <w:t>, por tanto es necesario refactorizar buena parte del código para que todo siga funcionando correctamente y que se puedan añadir nuevas ruedas debajo</w:t>
       </w:r>
       <w:r>
         <w:t>:</w:t>
@@ -688,15 +624,7 @@
         <w:pStyle w:val="Prrafodelista"/>
       </w:pPr>
       <w:r>
-        <w:t xml:space="preserve">En este caso se ven las 50 entradas máximas que debería poder tener la </w:t>
-      </w:r>
-      <w:proofErr w:type="spellStart"/>
-      <w:r>
-        <w:t>maquina</w:t>
-      </w:r>
-      <w:proofErr w:type="spellEnd"/>
-      <w:r>
-        <w:t>.</w:t>
+        <w:t>En este caso se ven las 50 entradas máximas que debería poder tener la maquina.</w:t>
       </w:r>
     </w:p>
     <w:p>
@@ -721,15 +649,7 @@
         <w:t xml:space="preserve">una herencia de </w:t>
       </w:r>
       <w:r>
-        <w:t xml:space="preserve">las diferentes figuras de </w:t>
-      </w:r>
-      <w:proofErr w:type="spellStart"/>
-      <w:r>
-        <w:t>shape</w:t>
-      </w:r>
-      <w:proofErr w:type="spellEnd"/>
-      <w:r>
-        <w:t>:</w:t>
+        <w:t>las diferentes figuras de shape:</w:t>
       </w:r>
     </w:p>
     <w:p>
@@ -785,47 +705,7 @@
         <w:t xml:space="preserve">Esto se traspasa a código, lo cual nos permitirá </w:t>
       </w:r>
       <w:r>
-        <w:t xml:space="preserve">hacer que el cuerpo del symbol ahora sea una figura, y ahora </w:t>
-      </w:r>
-      <w:proofErr w:type="spellStart"/>
-      <w:r>
-        <w:t>slotMachine</w:t>
-      </w:r>
-      <w:proofErr w:type="spellEnd"/>
-      <w:r>
-        <w:t xml:space="preserve"> tenga dentro de </w:t>
-      </w:r>
-      <w:proofErr w:type="spellStart"/>
-      <w:r>
-        <w:t>si</w:t>
-      </w:r>
-      <w:proofErr w:type="spellEnd"/>
-      <w:r>
-        <w:t xml:space="preserve"> diferentes Figures. El objetivo de que </w:t>
-      </w:r>
-      <w:proofErr w:type="spellStart"/>
-      <w:r>
-        <w:t>slotMachine</w:t>
-      </w:r>
-      <w:proofErr w:type="spellEnd"/>
-      <w:r>
-        <w:t xml:space="preserve"> tenga diferentes Figures es para que, cada </w:t>
-      </w:r>
-      <w:proofErr w:type="spellStart"/>
-      <w:r>
-        <w:t>ves</w:t>
-      </w:r>
-      <w:proofErr w:type="spellEnd"/>
-      <w:r>
-        <w:t xml:space="preserve"> que cree una rueda, le diga de </w:t>
-      </w:r>
-      <w:proofErr w:type="spellStart"/>
-      <w:r>
-        <w:t>que</w:t>
-      </w:r>
-      <w:proofErr w:type="spellEnd"/>
-      <w:r>
-        <w:t xml:space="preserve"> color es el símbolo y la forma del símbolo.</w:t>
+        <w:t>hacer que el cuerpo del symbol ahora sea una figura, y ahora slotMachine tenga dentro de si diferentes Figures. El objetivo de que slotMachine tenga diferentes Figures es para que, cada ves que cree una rueda, le diga de que color es el símbolo y la forma del símbolo.</w:t>
       </w:r>
     </w:p>
     <w:p>
@@ -890,8 +770,20 @@
         <w:t>añadir varios colores de símbolos, ahí se puede apreciar el cambio, permitiendo que tenga un poco más de azar, al tener diferentes figuras dependiendo del color.</w:t>
       </w:r>
     </w:p>
-    <w:p/>
-    <w:p/>
+    <w:p>
+      <w:pPr>
+        <w:rPr>
+          <w:lang w:val="es-CO"/>
+        </w:rPr>
+      </w:pPr>
+    </w:p>
+    <w:p>
+      <w:pPr>
+        <w:rPr>
+          <w:lang w:val="es-CO"/>
+        </w:rPr>
+      </w:pPr>
+    </w:p>
     <w:p>
       <w:pPr>
         <w:rPr>
@@ -990,7 +882,7 @@
       <w:tr>
         <w:tc>
           <w:tcPr>
-            <w:tcW w:w="1969" w:type="dxa"/>
+            <w:tcW w:w="2033" w:type="dxa"/>
           </w:tcPr>
           <w:p>
             <w:pPr>
@@ -1008,7 +900,7 @@
         </w:tc>
         <w:tc>
           <w:tcPr>
-            <w:tcW w:w="6580" w:type="dxa"/>
+            <w:tcW w:w="6516" w:type="dxa"/>
           </w:tcPr>
           <w:p>
             <w:pPr>
@@ -1028,7 +920,7 @@
       <w:tr>
         <w:tc>
           <w:tcPr>
-            <w:tcW w:w="1969" w:type="dxa"/>
+            <w:tcW w:w="2033" w:type="dxa"/>
           </w:tcPr>
           <w:p>
             <w:pPr>
@@ -1036,33 +928,23 @@
                 <w:lang w:val="es-CO"/>
               </w:rPr>
             </w:pPr>
-            <w:proofErr w:type="spellStart"/>
-            <w:proofErr w:type="gramStart"/>
             <w:r>
               <w:rPr>
                 <w:lang w:val="es-CO"/>
               </w:rPr>
               <w:t>addWheel</w:t>
             </w:r>
-            <w:proofErr w:type="spellEnd"/>
-            <w:r>
-              <w:rPr>
-                <w:lang w:val="es-CO"/>
-              </w:rPr>
-              <w:t>(</w:t>
-            </w:r>
-            <w:proofErr w:type="gramEnd"/>
-            <w:r>
-              <w:rPr>
-                <w:lang w:val="es-CO"/>
-              </w:rPr>
-              <w:t>)</w:t>
+            <w:r>
+              <w:rPr>
+                <w:lang w:val="es-CO"/>
+              </w:rPr>
+              <w:t>()</w:t>
             </w:r>
           </w:p>
         </w:tc>
         <w:tc>
           <w:tcPr>
-            <w:tcW w:w="6580" w:type="dxa"/>
+            <w:tcW w:w="6516" w:type="dxa"/>
           </w:tcPr>
           <w:p>
             <w:pPr>
@@ -1070,8 +952,6 @@
                 <w:lang w:val="es-CO"/>
               </w:rPr>
             </w:pPr>
-            <w:proofErr w:type="spellStart"/>
-            <w:proofErr w:type="gramStart"/>
             <w:r>
               <w:rPr>
                 <w:lang w:val="es-CO"/>
@@ -1106,27 +986,7 @@
               <w:rPr>
                 <w:lang w:val="es-CO"/>
               </w:rPr>
-              <w:t>IfWheelAdded</w:t>
-            </w:r>
-            <w:proofErr w:type="spellEnd"/>
-            <w:r>
-              <w:rPr>
-                <w:lang w:val="es-CO"/>
-              </w:rPr>
-              <w:t>(</w:t>
-            </w:r>
-            <w:proofErr w:type="gramEnd"/>
-            <w:r>
-              <w:rPr>
-                <w:lang w:val="es-CO"/>
-              </w:rPr>
-              <w:t>)</w:t>
-            </w:r>
-            <w:r>
-              <w:rPr>
-                <w:lang w:val="es-CO"/>
-              </w:rPr>
-              <w:t xml:space="preserve"> </w:t>
+              <w:t xml:space="preserve">IfWheelAdded() </w:t>
             </w:r>
             <w:r>
               <w:rPr>
@@ -1141,8 +1001,6 @@
                 <w:lang w:val="es-CO"/>
               </w:rPr>
             </w:pPr>
-            <w:proofErr w:type="spellStart"/>
-            <w:proofErr w:type="gramStart"/>
             <w:r>
               <w:rPr>
                 <w:lang w:val="es-CO"/>
@@ -1159,21 +1017,7 @@
               <w:rPr>
                 <w:lang w:val="es-CO"/>
               </w:rPr>
-              <w:t>AtEndIfPosTooBig</w:t>
-            </w:r>
-            <w:proofErr w:type="spellEnd"/>
-            <w:r>
-              <w:rPr>
-                <w:lang w:val="es-CO"/>
-              </w:rPr>
-              <w:t>(</w:t>
-            </w:r>
-            <w:proofErr w:type="gramEnd"/>
-            <w:r>
-              <w:rPr>
-                <w:lang w:val="es-CO"/>
-              </w:rPr>
-              <w:t>)</w:t>
+              <w:t>AtEndIfPosTooBig()</w:t>
             </w:r>
           </w:p>
           <w:p>
@@ -1182,8 +1026,6 @@
                 <w:lang w:val="es-CO"/>
               </w:rPr>
             </w:pPr>
-            <w:proofErr w:type="spellStart"/>
-            <w:proofErr w:type="gramStart"/>
             <w:r>
               <w:rPr>
                 <w:lang w:val="es-CO"/>
@@ -1200,21 +1042,7 @@
               <w:rPr>
                 <w:lang w:val="es-CO"/>
               </w:rPr>
-              <w:t>AtStartIfPosTooShort</w:t>
-            </w:r>
-            <w:proofErr w:type="spellEnd"/>
-            <w:r>
-              <w:rPr>
-                <w:lang w:val="es-CO"/>
-              </w:rPr>
-              <w:t>(</w:t>
-            </w:r>
-            <w:proofErr w:type="gramEnd"/>
-            <w:r>
-              <w:rPr>
-                <w:lang w:val="es-CO"/>
-              </w:rPr>
-              <w:t>)</w:t>
+              <w:t>AtStartIfPosTooShort()</w:t>
             </w:r>
           </w:p>
         </w:tc>
@@ -1222,7 +1050,7 @@
       <w:tr>
         <w:tc>
           <w:tcPr>
-            <w:tcW w:w="1969" w:type="dxa"/>
+            <w:tcW w:w="2033" w:type="dxa"/>
           </w:tcPr>
           <w:p>
             <w:pPr>
@@ -1230,33 +1058,17 @@
                 <w:lang w:val="es-CO"/>
               </w:rPr>
             </w:pPr>
-            <w:proofErr w:type="spellStart"/>
-            <w:proofErr w:type="gramStart"/>
-            <w:r>
-              <w:rPr>
-                <w:lang w:val="es-CO"/>
-              </w:rPr>
-              <w:t>delWheel</w:t>
-            </w:r>
-            <w:proofErr w:type="spellEnd"/>
-            <w:r>
-              <w:rPr>
-                <w:lang w:val="es-CO"/>
-              </w:rPr>
-              <w:t>(</w:t>
-            </w:r>
-            <w:proofErr w:type="gramEnd"/>
-            <w:r>
-              <w:rPr>
-                <w:lang w:val="es-CO"/>
-              </w:rPr>
-              <w:t>)</w:t>
+            <w:r>
+              <w:rPr>
+                <w:lang w:val="es-CO"/>
+              </w:rPr>
+              <w:t>delWheel()</w:t>
             </w:r>
           </w:p>
         </w:tc>
         <w:tc>
           <w:tcPr>
-            <w:tcW w:w="6580" w:type="dxa"/>
+            <w:tcW w:w="6516" w:type="dxa"/>
           </w:tcPr>
           <w:p>
             <w:pPr>
@@ -1264,8 +1076,6 @@
                 <w:lang w:val="es-CO"/>
               </w:rPr>
             </w:pPr>
-            <w:proofErr w:type="spellStart"/>
-            <w:proofErr w:type="gramStart"/>
             <w:r>
               <w:rPr>
                 <w:lang w:val="es-CO"/>
@@ -1302,25 +1112,11 @@
               </w:rPr>
               <w:t>Deleted</w:t>
             </w:r>
-            <w:proofErr w:type="spellEnd"/>
-            <w:r>
-              <w:rPr>
-                <w:lang w:val="es-CO"/>
-              </w:rPr>
-              <w:t>(</w:t>
-            </w:r>
-            <w:proofErr w:type="gramEnd"/>
-            <w:r>
-              <w:rPr>
-                <w:lang w:val="es-CO"/>
-              </w:rPr>
-              <w:t>)</w:t>
-            </w:r>
-            <w:r>
-              <w:rPr>
-                <w:lang w:val="es-CO"/>
-              </w:rPr>
-              <w:t xml:space="preserve"> </w:t>
+            <w:r>
+              <w:rPr>
+                <w:lang w:val="es-CO"/>
+              </w:rPr>
+              <w:t xml:space="preserve">() </w:t>
             </w:r>
           </w:p>
           <w:p>
@@ -1329,39 +1125,11 @@
                 <w:lang w:val="es-CO"/>
               </w:rPr>
             </w:pPr>
-            <w:proofErr w:type="spellStart"/>
-            <w:proofErr w:type="gramStart"/>
-            <w:r>
-              <w:rPr>
-                <w:lang w:val="es-CO"/>
-              </w:rPr>
-              <w:t>shouldDelete</w:t>
-            </w:r>
-            <w:r>
-              <w:rPr>
-                <w:lang w:val="es-CO"/>
-              </w:rPr>
-              <w:t>Wheel</w:t>
-            </w:r>
-            <w:r>
-              <w:rPr>
-                <w:lang w:val="es-CO"/>
-              </w:rPr>
-              <w:t>AtEndIfPosTooBig</w:t>
-            </w:r>
-            <w:proofErr w:type="spellEnd"/>
-            <w:r>
-              <w:rPr>
-                <w:lang w:val="es-CO"/>
-              </w:rPr>
-              <w:t>(</w:t>
-            </w:r>
-            <w:proofErr w:type="gramEnd"/>
-            <w:r>
-              <w:rPr>
-                <w:lang w:val="es-CO"/>
-              </w:rPr>
-              <w:t>)</w:t>
+            <w:r>
+              <w:rPr>
+                <w:lang w:val="es-CO"/>
+              </w:rPr>
+              <w:t>shouldDeleteWheelAtEndIfPosTooBig()</w:t>
             </w:r>
           </w:p>
           <w:p>
@@ -1370,25 +1138,11 @@
                 <w:lang w:val="es-CO"/>
               </w:rPr>
             </w:pPr>
-            <w:proofErr w:type="spellStart"/>
-            <w:proofErr w:type="gramStart"/>
-            <w:r>
-              <w:rPr>
-                <w:lang w:val="es-CO"/>
-              </w:rPr>
-              <w:t>shouldDelete</w:t>
-            </w:r>
-            <w:r>
-              <w:rPr>
-                <w:lang w:val="es-CO"/>
-              </w:rPr>
-              <w:t>Wheel</w:t>
-            </w:r>
-            <w:r>
-              <w:rPr>
-                <w:lang w:val="es-CO"/>
-              </w:rPr>
-              <w:t>At</w:t>
+            <w:r>
+              <w:rPr>
+                <w:lang w:val="es-CO"/>
+              </w:rPr>
+              <w:t>shouldDeleteWheelAt</w:t>
             </w:r>
             <w:r>
               <w:rPr>
@@ -1408,19 +1162,11 @@
               </w:rPr>
               <w:t>Little</w:t>
             </w:r>
-            <w:proofErr w:type="spellEnd"/>
-            <w:r>
-              <w:rPr>
-                <w:lang w:val="es-CO"/>
-              </w:rPr>
-              <w:t>(</w:t>
-            </w:r>
-            <w:proofErr w:type="gramEnd"/>
-            <w:r>
-              <w:rPr>
-                <w:lang w:val="es-CO"/>
-              </w:rPr>
-              <w:t>)</w:t>
+            <w:r>
+              <w:rPr>
+                <w:lang w:val="es-CO"/>
+              </w:rPr>
+              <w:t>()</w:t>
             </w:r>
           </w:p>
         </w:tc>
@@ -1428,7 +1174,7 @@
       <w:tr>
         <w:tc>
           <w:tcPr>
-            <w:tcW w:w="1969" w:type="dxa"/>
+            <w:tcW w:w="2033" w:type="dxa"/>
           </w:tcPr>
           <w:p>
             <w:pPr>
@@ -1436,25 +1182,17 @@
                 <w:lang w:val="es-CO"/>
               </w:rPr>
             </w:pPr>
-            <w:proofErr w:type="gramStart"/>
-            <w:r>
-              <w:rPr>
-                <w:lang w:val="es-CO"/>
-              </w:rPr>
-              <w:t>Swap(</w:t>
-            </w:r>
-            <w:proofErr w:type="gramEnd"/>
-            <w:r>
-              <w:rPr>
-                <w:lang w:val="es-CO"/>
-              </w:rPr>
-              <w:t>)</w:t>
+            <w:r>
+              <w:rPr>
+                <w:lang w:val="es-CO"/>
+              </w:rPr>
+              <w:t>Swap()</w:t>
             </w:r>
           </w:p>
         </w:tc>
         <w:tc>
           <w:tcPr>
-            <w:tcW w:w="6580" w:type="dxa"/>
+            <w:tcW w:w="6516" w:type="dxa"/>
           </w:tcPr>
           <w:p>
             <w:pPr>
@@ -1462,8 +1200,6 @@
                 <w:lang w:val="es-CO"/>
               </w:rPr>
             </w:pPr>
-            <w:proofErr w:type="spellStart"/>
-            <w:proofErr w:type="gramStart"/>
             <w:r>
               <w:rPr>
                 <w:lang w:val="es-CO"/>
@@ -1494,19 +1230,11 @@
               </w:rPr>
               <w:t>geColorsOrder</w:t>
             </w:r>
-            <w:proofErr w:type="spellEnd"/>
-            <w:r>
-              <w:rPr>
-                <w:lang w:val="es-CO"/>
-              </w:rPr>
-              <w:t>(</w:t>
-            </w:r>
-            <w:proofErr w:type="gramEnd"/>
-            <w:r>
-              <w:rPr>
-                <w:lang w:val="es-CO"/>
-              </w:rPr>
-              <w:t>)</w:t>
+            <w:r>
+              <w:rPr>
+                <w:lang w:val="es-CO"/>
+              </w:rPr>
+              <w:t>()</w:t>
             </w:r>
           </w:p>
           <w:p>
@@ -1515,27 +1243,11 @@
                 <w:lang w:val="es-CO"/>
               </w:rPr>
             </w:pPr>
-            <w:proofErr w:type="spellStart"/>
-            <w:proofErr w:type="gramStart"/>
-            <w:r>
-              <w:rPr>
-                <w:lang w:val="es-CO"/>
-              </w:rPr>
-              <w:t>shouldNotChangeIfSwapWithTheSameWheel</w:t>
-            </w:r>
-            <w:proofErr w:type="spellEnd"/>
-            <w:r>
-              <w:rPr>
-                <w:lang w:val="es-CO"/>
-              </w:rPr>
-              <w:t>(</w:t>
-            </w:r>
-            <w:proofErr w:type="gramEnd"/>
-            <w:r>
-              <w:rPr>
-                <w:lang w:val="es-CO"/>
-              </w:rPr>
-              <w:t>)</w:t>
+            <w:r>
+              <w:rPr>
+                <w:lang w:val="es-CO"/>
+              </w:rPr>
+              <w:t>shouldNotChangeIfSwapWithTheSameWheel()</w:t>
             </w:r>
           </w:p>
           <w:p>
@@ -1569,7 +1281,7 @@
       <w:tr>
         <w:tc>
           <w:tcPr>
-            <w:tcW w:w="1969" w:type="dxa"/>
+            <w:tcW w:w="2033" w:type="dxa"/>
           </w:tcPr>
           <w:p>
             <w:pPr>
@@ -1577,25 +1289,17 @@
                 <w:lang w:val="es-CO"/>
               </w:rPr>
             </w:pPr>
-            <w:proofErr w:type="gramStart"/>
-            <w:r>
-              <w:rPr>
-                <w:lang w:val="es-CO"/>
-              </w:rPr>
-              <w:t>Lock(</w:t>
-            </w:r>
-            <w:proofErr w:type="gramEnd"/>
-            <w:r>
-              <w:rPr>
-                <w:lang w:val="es-CO"/>
-              </w:rPr>
-              <w:t>)</w:t>
+            <w:r>
+              <w:rPr>
+                <w:lang w:val="es-CO"/>
+              </w:rPr>
+              <w:t>Lock()</w:t>
             </w:r>
           </w:p>
         </w:tc>
         <w:tc>
           <w:tcPr>
-            <w:tcW w:w="6580" w:type="dxa"/>
+            <w:tcW w:w="6516" w:type="dxa"/>
           </w:tcPr>
           <w:p>
             <w:pPr>
@@ -1603,8 +1307,6 @@
                 <w:lang w:val="es-CO"/>
               </w:rPr>
             </w:pPr>
-            <w:proofErr w:type="spellStart"/>
-            <w:proofErr w:type="gramStart"/>
             <w:r>
               <w:rPr>
                 <w:lang w:val="es-CO"/>
@@ -1623,19 +1325,11 @@
               </w:rPr>
               <w:t>IfItIslocked</w:t>
             </w:r>
-            <w:proofErr w:type="spellEnd"/>
-            <w:r>
-              <w:rPr>
-                <w:lang w:val="es-CO"/>
-              </w:rPr>
-              <w:t>(</w:t>
-            </w:r>
-            <w:proofErr w:type="gramEnd"/>
-            <w:r>
-              <w:rPr>
-                <w:lang w:val="es-CO"/>
-              </w:rPr>
-              <w:t>)</w:t>
+            <w:r>
+              <w:rPr>
+                <w:lang w:val="es-CO"/>
+              </w:rPr>
+              <w:t>()</w:t>
             </w:r>
           </w:p>
           <w:p>
@@ -1662,7 +1356,7 @@
       <w:tr>
         <w:tc>
           <w:tcPr>
-            <w:tcW w:w="1969" w:type="dxa"/>
+            <w:tcW w:w="2033" w:type="dxa"/>
           </w:tcPr>
           <w:p>
             <w:pPr>
@@ -1670,33 +1364,17 @@
                 <w:lang w:val="es-CO"/>
               </w:rPr>
             </w:pPr>
-            <w:proofErr w:type="spellStart"/>
-            <w:proofErr w:type="gramStart"/>
-            <w:r>
-              <w:rPr>
-                <w:lang w:val="es-CO"/>
-              </w:rPr>
-              <w:t>Unlock</w:t>
-            </w:r>
-            <w:proofErr w:type="spellEnd"/>
-            <w:r>
-              <w:rPr>
-                <w:lang w:val="es-CO"/>
-              </w:rPr>
-              <w:t>(</w:t>
-            </w:r>
-            <w:proofErr w:type="gramEnd"/>
-            <w:r>
-              <w:rPr>
-                <w:lang w:val="es-CO"/>
-              </w:rPr>
-              <w:t>)</w:t>
+            <w:r>
+              <w:rPr>
+                <w:lang w:val="es-CO"/>
+              </w:rPr>
+              <w:t>Unlock()</w:t>
             </w:r>
           </w:p>
         </w:tc>
         <w:tc>
           <w:tcPr>
-            <w:tcW w:w="6580" w:type="dxa"/>
+            <w:tcW w:w="6516" w:type="dxa"/>
           </w:tcPr>
           <w:p>
             <w:pPr>
@@ -1704,8 +1382,6 @@
                 <w:lang w:val="es-CO"/>
               </w:rPr>
             </w:pPr>
-            <w:proofErr w:type="spellStart"/>
-            <w:proofErr w:type="gramStart"/>
             <w:r>
               <w:rPr>
                 <w:lang w:val="es-CO"/>
@@ -1718,19 +1394,11 @@
               </w:rPr>
               <w:t>IfItIsUnlocked</w:t>
             </w:r>
-            <w:proofErr w:type="spellEnd"/>
-            <w:r>
-              <w:rPr>
-                <w:lang w:val="es-CO"/>
-              </w:rPr>
-              <w:t>(</w:t>
-            </w:r>
-            <w:proofErr w:type="gramEnd"/>
-            <w:r>
-              <w:rPr>
-                <w:lang w:val="es-CO"/>
-              </w:rPr>
-              <w:t>)</w:t>
+            <w:r>
+              <w:rPr>
+                <w:lang w:val="es-CO"/>
+              </w:rPr>
+              <w:t>()</w:t>
             </w:r>
           </w:p>
           <w:p>
@@ -1743,21 +1411,7 @@
               <w:rPr>
                 <w:lang w:val="es-CO"/>
               </w:rPr>
-              <w:t>//</w:t>
-            </w:r>
-            <w:proofErr w:type="spellStart"/>
-            <w:r>
-              <w:rPr>
-                <w:lang w:val="es-CO"/>
-              </w:rPr>
-              <w:t>Unlock</w:t>
-            </w:r>
-            <w:proofErr w:type="spellEnd"/>
-            <w:r>
-              <w:rPr>
-                <w:lang w:val="es-CO"/>
-              </w:rPr>
-              <w:t xml:space="preserve"> extremos</w:t>
+              <w:t>//Unlock extremos</w:t>
             </w:r>
             <w:r>
               <w:rPr>
@@ -1771,7 +1425,7 @@
       <w:tr>
         <w:tc>
           <w:tcPr>
-            <w:tcW w:w="1969" w:type="dxa"/>
+            <w:tcW w:w="2033" w:type="dxa"/>
           </w:tcPr>
           <w:p>
             <w:pPr>
@@ -1779,106 +1433,54 @@
                 <w:lang w:val="es-CO"/>
               </w:rPr>
             </w:pPr>
-            <w:proofErr w:type="spellStart"/>
-            <w:proofErr w:type="gramStart"/>
-            <w:r>
-              <w:rPr>
-                <w:lang w:val="es-CO"/>
-              </w:rPr>
-              <w:t>addSymbol</w:t>
-            </w:r>
-            <w:proofErr w:type="spellEnd"/>
-            <w:r>
-              <w:rPr>
-                <w:lang w:val="es-CO"/>
-              </w:rPr>
-              <w:t>(</w:t>
-            </w:r>
-            <w:proofErr w:type="gramEnd"/>
-            <w:r>
-              <w:rPr>
-                <w:lang w:val="es-CO"/>
-              </w:rPr>
-              <w:t>)</w:t>
+            <w:r>
+              <w:rPr>
+                <w:lang w:val="es-CO"/>
+              </w:rPr>
+              <w:t>addSymbol()</w:t>
             </w:r>
           </w:p>
         </w:tc>
         <w:tc>
           <w:tcPr>
-            <w:tcW w:w="6580" w:type="dxa"/>
+            <w:tcW w:w="6516" w:type="dxa"/>
           </w:tcPr>
           <w:p>
-            <w:proofErr w:type="spellStart"/>
-            <w:proofErr w:type="gramStart"/>
             <w:r>
               <w:t>shouldSymbolNumberBeGreater</w:t>
             </w:r>
             <w:r>
               <w:t>IfSymbolAdded</w:t>
             </w:r>
-            <w:proofErr w:type="spellEnd"/>
-            <w:r>
-              <w:t>(</w:t>
-            </w:r>
-            <w:proofErr w:type="gramEnd"/>
-            <w:r>
-              <w:t>)</w:t>
-            </w:r>
-          </w:p>
-          <w:p>
-            <w:proofErr w:type="spellStart"/>
-            <w:proofErr w:type="gramStart"/>
+            <w:r>
+              <w:t>()</w:t>
+            </w:r>
+          </w:p>
+          <w:p>
             <w:r>
               <w:t>should</w:t>
             </w:r>
             <w:r>
-              <w:t>SymbolBeInTheSpecificPosition</w:t>
-            </w:r>
-            <w:proofErr w:type="spellEnd"/>
-            <w:r>
-              <w:t>(</w:t>
-            </w:r>
-            <w:proofErr w:type="gramEnd"/>
-            <w:r>
-              <w:t>)</w:t>
-            </w:r>
-          </w:p>
-          <w:p>
-            <w:proofErr w:type="spellStart"/>
-            <w:proofErr w:type="gramStart"/>
-            <w:r>
-              <w:t>shouldNotAddARepeatedSymbol</w:t>
-            </w:r>
-            <w:proofErr w:type="spellEnd"/>
-            <w:r>
-              <w:t>(</w:t>
-            </w:r>
-            <w:proofErr w:type="gramEnd"/>
-            <w:r>
-              <w:t>)</w:t>
-            </w:r>
-          </w:p>
-          <w:p>
-            <w:proofErr w:type="spellStart"/>
-            <w:proofErr w:type="gramStart"/>
+              <w:t>SymbolBeInTheSpecificPosition()</w:t>
+            </w:r>
+          </w:p>
+          <w:p>
+            <w:r>
+              <w:t>shouldNotAddARepeatedSymbol()</w:t>
+            </w:r>
+          </w:p>
+          <w:p>
             <w:r>
               <w:t>shouldAddSymbol</w:t>
             </w:r>
             <w:r>
               <w:t>AtEndIfPosTooBig</w:t>
             </w:r>
-            <w:proofErr w:type="spellEnd"/>
-            <w:r>
-              <w:t>(</w:t>
-            </w:r>
-            <w:proofErr w:type="gramEnd"/>
-            <w:r>
-              <w:t>)</w:t>
-            </w:r>
-          </w:p>
-          <w:p>
-            <w:proofErr w:type="spellStart"/>
-            <w:proofErr w:type="gramStart"/>
+            <w:r>
+              <w:t>()</w:t>
+            </w:r>
+          </w:p>
+          <w:p>
             <w:r>
               <w:t>shouldAddSymbolAt</w:t>
             </w:r>
@@ -1891,18 +1493,11 @@
             <w:r>
               <w:t>Little</w:t>
             </w:r>
-            <w:proofErr w:type="spellEnd"/>
-            <w:r>
-              <w:t>(</w:t>
-            </w:r>
-            <w:proofErr w:type="gramEnd"/>
-            <w:r>
-              <w:t>)</w:t>
-            </w:r>
-          </w:p>
-          <w:p>
-            <w:proofErr w:type="spellStart"/>
-            <w:proofErr w:type="gramStart"/>
+            <w:r>
+              <w:t>()</w:t>
+            </w:r>
+          </w:p>
+          <w:p>
             <w:r>
               <w:t>shouldNotAddStrange</w:t>
             </w:r>
@@ -1912,13 +1507,8 @@
             <w:r>
               <w:t>s</w:t>
             </w:r>
-            <w:proofErr w:type="spellEnd"/>
-            <w:r>
-              <w:t>(</w:t>
-            </w:r>
-            <w:proofErr w:type="gramEnd"/>
-            <w:r>
-              <w:t>)</w:t>
+            <w:r>
+              <w:t>()</w:t>
             </w:r>
           </w:p>
         </w:tc>
@@ -1926,7 +1516,7 @@
       <w:tr>
         <w:tc>
           <w:tcPr>
-            <w:tcW w:w="1969" w:type="dxa"/>
+            <w:tcW w:w="2033" w:type="dxa"/>
           </w:tcPr>
           <w:p>
             <w:pPr>
@@ -1934,33 +1524,17 @@
                 <w:lang w:val="es-CO"/>
               </w:rPr>
             </w:pPr>
-            <w:proofErr w:type="spellStart"/>
-            <w:proofErr w:type="gramStart"/>
-            <w:r>
-              <w:rPr>
-                <w:lang w:val="es-CO"/>
-              </w:rPr>
-              <w:t>delSymbol</w:t>
-            </w:r>
-            <w:proofErr w:type="spellEnd"/>
-            <w:r>
-              <w:rPr>
-                <w:lang w:val="es-CO"/>
-              </w:rPr>
-              <w:t>(</w:t>
-            </w:r>
-            <w:proofErr w:type="gramEnd"/>
-            <w:r>
-              <w:rPr>
-                <w:lang w:val="es-CO"/>
-              </w:rPr>
-              <w:t>)</w:t>
+            <w:r>
+              <w:rPr>
+                <w:lang w:val="es-CO"/>
+              </w:rPr>
+              <w:t>delSymbol()</w:t>
             </w:r>
           </w:p>
         </w:tc>
         <w:tc>
           <w:tcPr>
-            <w:tcW w:w="6580" w:type="dxa"/>
+            <w:tcW w:w="6516" w:type="dxa"/>
           </w:tcPr>
           <w:p>
             <w:pPr>
@@ -1968,8 +1542,6 @@
                 <w:lang w:val="es-CO"/>
               </w:rPr>
             </w:pPr>
-            <w:proofErr w:type="spellStart"/>
-            <w:proofErr w:type="gramStart"/>
             <w:r>
               <w:rPr>
                 <w:lang w:val="es-CO"/>
@@ -1988,19 +1560,11 @@
               </w:rPr>
               <w:t>IfSymbolWasDeleted</w:t>
             </w:r>
-            <w:proofErr w:type="spellEnd"/>
-            <w:r>
-              <w:rPr>
-                <w:lang w:val="es-CO"/>
-              </w:rPr>
-              <w:t>(</w:t>
-            </w:r>
-            <w:proofErr w:type="gramEnd"/>
-            <w:r>
-              <w:rPr>
-                <w:lang w:val="es-CO"/>
-              </w:rPr>
-              <w:t>)</w:t>
+            <w:r>
+              <w:rPr>
+                <w:lang w:val="es-CO"/>
+              </w:rPr>
+              <w:t>()</w:t>
             </w:r>
           </w:p>
           <w:p>
@@ -2009,8 +1573,6 @@
                 <w:lang w:val="es-CO"/>
               </w:rPr>
             </w:pPr>
-            <w:proofErr w:type="spellStart"/>
-            <w:proofErr w:type="gramStart"/>
             <w:r>
               <w:rPr>
                 <w:lang w:val="es-CO"/>
@@ -2039,21 +1601,7 @@
               <w:rPr>
                 <w:lang w:val="es-CO"/>
               </w:rPr>
-              <w:t>Exists</w:t>
-            </w:r>
-            <w:proofErr w:type="spellEnd"/>
-            <w:r>
-              <w:rPr>
-                <w:lang w:val="es-CO"/>
-              </w:rPr>
-              <w:t>(</w:t>
-            </w:r>
-            <w:proofErr w:type="gramEnd"/>
-            <w:r>
-              <w:rPr>
-                <w:lang w:val="es-CO"/>
-              </w:rPr>
-              <w:t>)</w:t>
+              <w:t>Exists()</w:t>
             </w:r>
           </w:p>
         </w:tc>
@@ -2061,7 +1609,7 @@
       <w:tr>
         <w:tc>
           <w:tcPr>
-            <w:tcW w:w="1969" w:type="dxa"/>
+            <w:tcW w:w="2033" w:type="dxa"/>
           </w:tcPr>
           <w:p>
             <w:pPr>
@@ -2069,34 +1617,18 @@
                 <w:lang w:val="es-CO"/>
               </w:rPr>
             </w:pPr>
-            <w:proofErr w:type="spellStart"/>
-            <w:proofErr w:type="gramStart"/>
             <w:r>
               <w:rPr>
                 <w:lang w:val="es-CO"/>
               </w:rPr>
               <w:lastRenderedPageBreak/>
-              <w:t>placeSymbol</w:t>
-            </w:r>
-            <w:proofErr w:type="spellEnd"/>
-            <w:r>
-              <w:rPr>
-                <w:lang w:val="es-CO"/>
-              </w:rPr>
-              <w:t>(</w:t>
-            </w:r>
-            <w:proofErr w:type="gramEnd"/>
-            <w:r>
-              <w:rPr>
-                <w:lang w:val="es-CO"/>
-              </w:rPr>
-              <w:t>)</w:t>
+              <w:t>placeSymbol()</w:t>
             </w:r>
           </w:p>
         </w:tc>
         <w:tc>
           <w:tcPr>
-            <w:tcW w:w="6580" w:type="dxa"/>
+            <w:tcW w:w="6516" w:type="dxa"/>
           </w:tcPr>
           <w:p>
             <w:pPr>
@@ -2104,8 +1636,6 @@
                 <w:lang w:val="es-CO"/>
               </w:rPr>
             </w:pPr>
-            <w:proofErr w:type="spellStart"/>
-            <w:proofErr w:type="gramStart"/>
             <w:r>
               <w:rPr>
                 <w:lang w:val="es-CO"/>
@@ -2124,19 +1654,11 @@
               </w:rPr>
               <w:t>eWheelSymbol</w:t>
             </w:r>
-            <w:proofErr w:type="spellEnd"/>
-            <w:r>
-              <w:rPr>
-                <w:lang w:val="es-CO"/>
-              </w:rPr>
-              <w:t>(</w:t>
-            </w:r>
-            <w:proofErr w:type="gramEnd"/>
-            <w:r>
-              <w:rPr>
-                <w:lang w:val="es-CO"/>
-              </w:rPr>
-              <w:t>)</w:t>
+            <w:r>
+              <w:rPr>
+                <w:lang w:val="es-CO"/>
+              </w:rPr>
+              <w:t>()</w:t>
             </w:r>
           </w:p>
           <w:p>
@@ -2145,27 +1667,11 @@
                 <w:lang w:val="es-CO"/>
               </w:rPr>
             </w:pPr>
-            <w:proofErr w:type="spellStart"/>
-            <w:proofErr w:type="gramStart"/>
-            <w:r>
-              <w:rPr>
-                <w:lang w:val="es-CO"/>
-              </w:rPr>
-              <w:t>shouldStayIfSymbolDoesNotExists</w:t>
-            </w:r>
-            <w:proofErr w:type="spellEnd"/>
-            <w:r>
-              <w:rPr>
-                <w:lang w:val="es-CO"/>
-              </w:rPr>
-              <w:t>(</w:t>
-            </w:r>
-            <w:proofErr w:type="gramEnd"/>
-            <w:r>
-              <w:rPr>
-                <w:lang w:val="es-CO"/>
-              </w:rPr>
-              <w:t>)</w:t>
+            <w:r>
+              <w:rPr>
+                <w:lang w:val="es-CO"/>
+              </w:rPr>
+              <w:t>shouldStayIfSymbolDoesNotExists()</w:t>
             </w:r>
           </w:p>
         </w:tc>
@@ -2173,7 +1679,7 @@
       <w:tr>
         <w:tc>
           <w:tcPr>
-            <w:tcW w:w="1969" w:type="dxa"/>
+            <w:tcW w:w="2033" w:type="dxa"/>
           </w:tcPr>
           <w:p>
             <w:pPr>
@@ -2185,27 +1691,13 @@
               <w:rPr>
                 <w:lang w:val="es-CO"/>
               </w:rPr>
-              <w:t>spin(</w:t>
-            </w:r>
-            <w:proofErr w:type="spellStart"/>
-            <w:r>
-              <w:rPr>
-                <w:lang w:val="es-CO"/>
-              </w:rPr>
-              <w:t>wheel</w:t>
-            </w:r>
-            <w:proofErr w:type="spellEnd"/>
-            <w:r>
-              <w:rPr>
-                <w:lang w:val="es-CO"/>
-              </w:rPr>
-              <w:t>)</w:t>
+              <w:t>spin(wheel)</w:t>
             </w:r>
           </w:p>
         </w:tc>
         <w:tc>
           <w:tcPr>
-            <w:tcW w:w="6580" w:type="dxa"/>
+            <w:tcW w:w="6516" w:type="dxa"/>
           </w:tcPr>
           <w:p>
             <w:pPr>
@@ -2213,8 +1705,6 @@
                 <w:lang w:val="es-CO"/>
               </w:rPr>
             </w:pPr>
-            <w:proofErr w:type="spellStart"/>
-            <w:proofErr w:type="gramStart"/>
             <w:r>
               <w:rPr>
                 <w:lang w:val="es-CO"/>
@@ -2237,21 +1727,7 @@
               <w:rPr>
                 <w:lang w:val="es-CO"/>
               </w:rPr>
-              <w:t>ASpecificWheel</w:t>
-            </w:r>
-            <w:proofErr w:type="spellEnd"/>
-            <w:r>
-              <w:rPr>
-                <w:lang w:val="es-CO"/>
-              </w:rPr>
-              <w:t>(</w:t>
-            </w:r>
-            <w:proofErr w:type="gramEnd"/>
-            <w:r>
-              <w:rPr>
-                <w:lang w:val="es-CO"/>
-              </w:rPr>
-              <w:t>)</w:t>
+              <w:t>ASpecificWheel()</w:t>
             </w:r>
           </w:p>
           <w:p>
@@ -2260,8 +1736,6 @@
                 <w:lang w:val="es-CO"/>
               </w:rPr>
             </w:pPr>
-            <w:proofErr w:type="spellStart"/>
-            <w:proofErr w:type="gramStart"/>
             <w:r>
               <w:rPr>
                 <w:lang w:val="es-CO"/>
@@ -2278,21 +1752,7 @@
               <w:rPr>
                 <w:lang w:val="es-CO"/>
               </w:rPr>
-              <w:t>LastWheelIfPosTooBig</w:t>
-            </w:r>
-            <w:proofErr w:type="spellEnd"/>
-            <w:r>
-              <w:rPr>
-                <w:lang w:val="es-CO"/>
-              </w:rPr>
-              <w:t>(</w:t>
-            </w:r>
-            <w:proofErr w:type="gramEnd"/>
-            <w:r>
-              <w:rPr>
-                <w:lang w:val="es-CO"/>
-              </w:rPr>
-              <w:t>)</w:t>
+              <w:t>LastWheelIfPosTooBig()</w:t>
             </w:r>
           </w:p>
           <w:p>
@@ -2301,8 +1761,6 @@
                 <w:lang w:val="es-CO"/>
               </w:rPr>
             </w:pPr>
-            <w:proofErr w:type="spellStart"/>
-            <w:proofErr w:type="gramStart"/>
             <w:r>
               <w:rPr>
                 <w:lang w:val="es-CO"/>
@@ -2319,21 +1777,7 @@
               <w:rPr>
                 <w:lang w:val="es-CO"/>
               </w:rPr>
-              <w:t>FirstWheelIfPosTooShort</w:t>
-            </w:r>
-            <w:proofErr w:type="spellEnd"/>
-            <w:r>
-              <w:rPr>
-                <w:lang w:val="es-CO"/>
-              </w:rPr>
-              <w:t>(</w:t>
-            </w:r>
-            <w:proofErr w:type="gramEnd"/>
-            <w:r>
-              <w:rPr>
-                <w:lang w:val="es-CO"/>
-              </w:rPr>
-              <w:t>)</w:t>
+              <w:t>FirstWheelIfPosTooShort()</w:t>
             </w:r>
           </w:p>
         </w:tc>
@@ -2341,7 +1785,7 @@
       <w:tr>
         <w:tc>
           <w:tcPr>
-            <w:tcW w:w="1969" w:type="dxa"/>
+            <w:tcW w:w="2033" w:type="dxa"/>
           </w:tcPr>
           <w:p>
             <w:pPr>
@@ -2349,215 +1793,59 @@
                 <w:lang w:val="es-CO"/>
               </w:rPr>
             </w:pPr>
-            <w:proofErr w:type="gramStart"/>
-            <w:r>
-              <w:rPr>
-                <w:lang w:val="es-CO"/>
-              </w:rPr>
-              <w:t>spin(</w:t>
-            </w:r>
-            <w:proofErr w:type="spellStart"/>
-            <w:proofErr w:type="gramEnd"/>
-            <w:r>
-              <w:rPr>
-                <w:lang w:val="es-CO"/>
-              </w:rPr>
-              <w:t>wheel</w:t>
-            </w:r>
-            <w:proofErr w:type="spellEnd"/>
-            <w:r>
-              <w:rPr>
-                <w:lang w:val="es-CO"/>
-              </w:rPr>
-              <w:t xml:space="preserve">, </w:t>
-            </w:r>
-            <w:proofErr w:type="spellStart"/>
-            <w:r>
-              <w:rPr>
-                <w:lang w:val="es-CO"/>
-              </w:rPr>
-              <w:t>steps</w:t>
-            </w:r>
-            <w:proofErr w:type="spellEnd"/>
-            <w:r>
-              <w:rPr>
-                <w:lang w:val="es-CO"/>
-              </w:rPr>
-              <w:t>)</w:t>
+            <w:r>
+              <w:rPr>
+                <w:lang w:val="es-CO"/>
+              </w:rPr>
+              <w:t>spin(wheel, steps)</w:t>
             </w:r>
           </w:p>
         </w:tc>
         <w:tc>
           <w:tcPr>
-            <w:tcW w:w="6580" w:type="dxa"/>
+            <w:tcW w:w="6516" w:type="dxa"/>
           </w:tcPr>
           <w:p>
-            <w:pPr>
-              <w:rPr>
-                <w:lang w:val="es-CO"/>
-              </w:rPr>
-            </w:pPr>
-            <w:proofErr w:type="spellStart"/>
-            <w:proofErr w:type="gramStart"/>
-            <w:r>
-              <w:rPr>
-                <w:lang w:val="es-CO"/>
-              </w:rPr>
+            <w:r>
               <w:t>should</w:t>
             </w:r>
             <w:r>
-              <w:rPr>
-                <w:lang w:val="es-CO"/>
-              </w:rPr>
               <w:t>Spin</w:t>
             </w:r>
             <w:r>
-              <w:rPr>
-                <w:lang w:val="es-CO"/>
-              </w:rPr>
               <w:t>BackIfStepsAreNegatives</w:t>
             </w:r>
-            <w:proofErr w:type="spellEnd"/>
-            <w:r>
-              <w:rPr>
-                <w:lang w:val="es-CO"/>
-              </w:rPr>
-              <w:t>(</w:t>
-            </w:r>
-            <w:proofErr w:type="gramEnd"/>
-            <w:r>
-              <w:rPr>
-                <w:lang w:val="es-CO"/>
-              </w:rPr>
-              <w:t>)</w:t>
-            </w:r>
-          </w:p>
-          <w:p>
-            <w:pPr>
-              <w:rPr>
-                <w:lang w:val="es-CO"/>
-              </w:rPr>
-            </w:pPr>
-            <w:proofErr w:type="spellStart"/>
-            <w:proofErr w:type="gramStart"/>
-            <w:r>
-              <w:rPr>
-                <w:lang w:val="es-CO"/>
-              </w:rPr>
-              <w:t>shouldNotSpinIfStepsAreZero</w:t>
-            </w:r>
-            <w:proofErr w:type="spellEnd"/>
-            <w:r>
-              <w:rPr>
-                <w:lang w:val="es-CO"/>
-              </w:rPr>
-              <w:t>(</w:t>
-            </w:r>
-            <w:proofErr w:type="gramEnd"/>
-            <w:r>
-              <w:rPr>
-                <w:lang w:val="es-CO"/>
-              </w:rPr>
-              <w:t>)</w:t>
-            </w:r>
-          </w:p>
-          <w:p>
-            <w:pPr>
-              <w:rPr>
-                <w:lang w:val="es-CO"/>
-              </w:rPr>
-            </w:pPr>
-            <w:proofErr w:type="spellStart"/>
-            <w:proofErr w:type="gramStart"/>
-            <w:r>
-              <w:rPr>
-                <w:lang w:val="es-CO"/>
-              </w:rPr>
+            <w:r>
+              <w:t>()</w:t>
+            </w:r>
+          </w:p>
+          <w:p>
+            <w:r>
+              <w:t>shouldNotSpinIfStepsAreZero()</w:t>
+            </w:r>
+          </w:p>
+          <w:p>
+            <w:r>
               <w:t>shouldSpin</w:t>
             </w:r>
             <w:r>
-              <w:rPr>
-                <w:lang w:val="es-CO"/>
-              </w:rPr>
               <w:t>NPositions</w:t>
             </w:r>
             <w:r>
-              <w:rPr>
-                <w:lang w:val="es-CO"/>
-              </w:rPr>
               <w:t>Correctly</w:t>
             </w:r>
-            <w:proofErr w:type="spellEnd"/>
-            <w:r>
-              <w:rPr>
-                <w:lang w:val="es-CO"/>
-              </w:rPr>
-              <w:t>(</w:t>
-            </w:r>
-            <w:proofErr w:type="gramEnd"/>
-            <w:r>
-              <w:rPr>
-                <w:lang w:val="es-CO"/>
-              </w:rPr>
-              <w:t>)</w:t>
-            </w:r>
-          </w:p>
-          <w:p>
-            <w:pPr>
-              <w:rPr>
-                <w:lang w:val="es-CO"/>
-              </w:rPr>
-            </w:pPr>
-            <w:proofErr w:type="spellStart"/>
-            <w:proofErr w:type="gramStart"/>
-            <w:r>
-              <w:rPr>
-                <w:lang w:val="es-CO"/>
-              </w:rPr>
-              <w:t>shouldSpinLastWheelIfWheelNumIsTooBig</w:t>
-            </w:r>
-            <w:proofErr w:type="spellEnd"/>
-            <w:r>
-              <w:rPr>
-                <w:lang w:val="es-CO"/>
-              </w:rPr>
-              <w:t>(</w:t>
-            </w:r>
-            <w:proofErr w:type="gramEnd"/>
-            <w:r>
-              <w:rPr>
-                <w:lang w:val="es-CO"/>
-              </w:rPr>
-              <w:t>)</w:t>
-            </w:r>
-          </w:p>
-          <w:p>
-            <w:pPr>
-              <w:rPr>
-                <w:lang w:val="es-CO"/>
-              </w:rPr>
-            </w:pPr>
-            <w:proofErr w:type="spellStart"/>
-            <w:proofErr w:type="gramStart"/>
-            <w:r>
-              <w:rPr>
-                <w:lang w:val="es-CO"/>
-              </w:rPr>
-              <w:t>shouldSpinFirstWheelIfWheelNumIsTooShort</w:t>
-            </w:r>
-            <w:proofErr w:type="spellEnd"/>
-            <w:r>
-              <w:rPr>
-                <w:lang w:val="es-CO"/>
-              </w:rPr>
-              <w:t>(</w:t>
-            </w:r>
-            <w:proofErr w:type="gramEnd"/>
-            <w:r>
-              <w:rPr>
-                <w:lang w:val="es-CO"/>
-              </w:rPr>
-              <w:t>)</w:t>
+            <w:r>
+              <w:t>()</w:t>
+            </w:r>
+          </w:p>
+          <w:p>
+            <w:r>
+              <w:t>shouldSpinLastWheelIfWheelNumIsTooBig()</w:t>
+            </w:r>
+          </w:p>
+          <w:p>
+            <w:r>
+              <w:t>shouldSpinFirstWheelIfWheelNumIsTooShort()</w:t>
             </w:r>
           </w:p>
         </w:tc>
@@ -2565,7 +1853,7 @@
       <w:tr>
         <w:tc>
           <w:tcPr>
-            <w:tcW w:w="1969" w:type="dxa"/>
+            <w:tcW w:w="2033" w:type="dxa"/>
           </w:tcPr>
           <w:p>
             <w:pPr>
@@ -2577,27 +1865,13 @@
               <w:rPr>
                 <w:lang w:val="es-CO"/>
               </w:rPr>
-              <w:t>Spin(</w:t>
-            </w:r>
-            <w:proofErr w:type="spellStart"/>
-            <w:r>
-              <w:rPr>
-                <w:lang w:val="es-CO"/>
-              </w:rPr>
-              <w:t>setSymbols</w:t>
-            </w:r>
-            <w:proofErr w:type="spellEnd"/>
-            <w:r>
-              <w:rPr>
-                <w:lang w:val="es-CO"/>
-              </w:rPr>
-              <w:t>)</w:t>
+              <w:t>Spin(setSymbols)</w:t>
             </w:r>
           </w:p>
         </w:tc>
         <w:tc>
           <w:tcPr>
-            <w:tcW w:w="6580" w:type="dxa"/>
+            <w:tcW w:w="6516" w:type="dxa"/>
           </w:tcPr>
           <w:p>
             <w:pPr>
@@ -2605,8 +1879,6 @@
                 <w:lang w:val="es-CO"/>
               </w:rPr>
             </w:pPr>
-            <w:proofErr w:type="spellStart"/>
-            <w:proofErr w:type="gramStart"/>
             <w:r>
               <w:rPr>
                 <w:lang w:val="es-CO"/>
@@ -2637,19 +1909,11 @@
               </w:rPr>
               <w:t>AllSymbols</w:t>
             </w:r>
-            <w:proofErr w:type="spellEnd"/>
-            <w:r>
-              <w:rPr>
-                <w:lang w:val="es-CO"/>
-              </w:rPr>
-              <w:t>(</w:t>
-            </w:r>
-            <w:proofErr w:type="gramEnd"/>
-            <w:r>
-              <w:rPr>
-                <w:lang w:val="es-CO"/>
-              </w:rPr>
-              <w:t>)</w:t>
+            <w:r>
+              <w:rPr>
+                <w:lang w:val="es-CO"/>
+              </w:rPr>
+              <w:t>()</w:t>
             </w:r>
           </w:p>
           <w:p>
@@ -2658,27 +1922,11 @@
                 <w:lang w:val="es-CO"/>
               </w:rPr>
             </w:pPr>
-            <w:proofErr w:type="spellStart"/>
-            <w:proofErr w:type="gramStart"/>
-            <w:r>
-              <w:rPr>
-                <w:lang w:val="es-CO"/>
-              </w:rPr>
-              <w:t>shouldStayAWheelIfItsSymbolIsIncorrect</w:t>
-            </w:r>
-            <w:proofErr w:type="spellEnd"/>
-            <w:r>
-              <w:rPr>
-                <w:lang w:val="es-CO"/>
-              </w:rPr>
-              <w:t>(</w:t>
-            </w:r>
-            <w:proofErr w:type="gramEnd"/>
-            <w:r>
-              <w:rPr>
-                <w:lang w:val="es-CO"/>
-              </w:rPr>
-              <w:t>)</w:t>
+            <w:r>
+              <w:rPr>
+                <w:lang w:val="es-CO"/>
+              </w:rPr>
+              <w:t>shouldStayAWheelIfItsSymbolIsIncorrect()</w:t>
             </w:r>
           </w:p>
         </w:tc>
@@ -2686,7 +1934,7 @@
       <w:tr>
         <w:tc>
           <w:tcPr>
-            <w:tcW w:w="1969" w:type="dxa"/>
+            <w:tcW w:w="2033" w:type="dxa"/>
           </w:tcPr>
           <w:p>
             <w:pPr>
@@ -2694,25 +1942,17 @@
                 <w:lang w:val="es-CO"/>
               </w:rPr>
             </w:pPr>
-            <w:proofErr w:type="gramStart"/>
-            <w:r>
-              <w:rPr>
-                <w:lang w:val="es-CO"/>
-              </w:rPr>
-              <w:t>Spin(</w:t>
-            </w:r>
-            <w:proofErr w:type="gramEnd"/>
-            <w:r>
-              <w:rPr>
-                <w:lang w:val="es-CO"/>
-              </w:rPr>
-              <w:t>)</w:t>
+            <w:r>
+              <w:rPr>
+                <w:lang w:val="es-CO"/>
+              </w:rPr>
+              <w:t>Spin()</w:t>
             </w:r>
           </w:p>
         </w:tc>
         <w:tc>
           <w:tcPr>
-            <w:tcW w:w="6580" w:type="dxa"/>
+            <w:tcW w:w="6516" w:type="dxa"/>
           </w:tcPr>
           <w:p>
             <w:pPr>
@@ -2720,27 +1960,23 @@
                 <w:lang w:val="es-CO"/>
               </w:rPr>
             </w:pPr>
-            <w:proofErr w:type="spellStart"/>
-            <w:proofErr w:type="gramStart"/>
-            <w:r>
-              <w:rPr>
-                <w:lang w:val="es-CO"/>
-              </w:rPr>
-              <w:t>shouldChangeAllSymbols</w:t>
-            </w:r>
-            <w:proofErr w:type="spellEnd"/>
-            <w:r>
-              <w:rPr>
-                <w:lang w:val="es-CO"/>
-              </w:rPr>
-              <w:t>(</w:t>
-            </w:r>
-            <w:proofErr w:type="gramEnd"/>
-            <w:r>
-              <w:rPr>
-                <w:lang w:val="es-CO"/>
-              </w:rPr>
-              <w:t>)</w:t>
+            <w:r>
+              <w:rPr>
+                <w:lang w:val="es-CO"/>
+              </w:rPr>
+              <w:t>shouldChangeAll</w:t>
+            </w:r>
+            <w:r>
+              <w:rPr>
+                <w:lang w:val="es-CO"/>
+              </w:rPr>
+              <w:t>Wheels</w:t>
+            </w:r>
+            <w:r>
+              <w:rPr>
+                <w:lang w:val="es-CO"/>
+              </w:rPr>
+              <w:t>Symbols()</w:t>
             </w:r>
           </w:p>
         </w:tc>
@@ -2748,7 +1984,7 @@
       <w:tr>
         <w:tc>
           <w:tcPr>
-            <w:tcW w:w="1969" w:type="dxa"/>
+            <w:tcW w:w="2033" w:type="dxa"/>
           </w:tcPr>
           <w:p>
             <w:pPr>
@@ -2756,25 +1992,17 @@
                 <w:lang w:val="es-CO"/>
               </w:rPr>
             </w:pPr>
-            <w:proofErr w:type="gramStart"/>
-            <w:r>
-              <w:rPr>
-                <w:lang w:val="es-CO"/>
-              </w:rPr>
-              <w:t>Symbols(</w:t>
-            </w:r>
-            <w:proofErr w:type="gramEnd"/>
-            <w:r>
-              <w:rPr>
-                <w:lang w:val="es-CO"/>
-              </w:rPr>
-              <w:t>)</w:t>
+            <w:r>
+              <w:rPr>
+                <w:lang w:val="es-CO"/>
+              </w:rPr>
+              <w:t>distinctSymbols()</w:t>
             </w:r>
           </w:p>
         </w:tc>
         <w:tc>
           <w:tcPr>
-            <w:tcW w:w="6580" w:type="dxa"/>
+            <w:tcW w:w="6516" w:type="dxa"/>
           </w:tcPr>
           <w:p>
             <w:pPr>
@@ -2782,27 +2010,11 @@
                 <w:lang w:val="es-CO"/>
               </w:rPr>
             </w:pPr>
-            <w:proofErr w:type="spellStart"/>
-            <w:proofErr w:type="gramStart"/>
-            <w:r>
-              <w:rPr>
-                <w:lang w:val="es-CO"/>
-              </w:rPr>
-              <w:t>shouldGiveDifferentSymbolsIfISpin</w:t>
-            </w:r>
-            <w:proofErr w:type="spellEnd"/>
-            <w:r>
-              <w:rPr>
-                <w:lang w:val="es-CO"/>
-              </w:rPr>
-              <w:t>(</w:t>
-            </w:r>
-            <w:proofErr w:type="gramEnd"/>
-            <w:r>
-              <w:rPr>
-                <w:lang w:val="es-CO"/>
-              </w:rPr>
-              <w:t>)</w:t>
+            <w:r>
+              <w:rPr>
+                <w:lang w:val="es-CO"/>
+              </w:rPr>
+              <w:t>shouldGiveCorrectDistinctSymbolsNumber()</w:t>
             </w:r>
           </w:p>
         </w:tc>
@@ -2810,7 +2022,7 @@
       <w:tr>
         <w:tc>
           <w:tcPr>
-            <w:tcW w:w="1969" w:type="dxa"/>
+            <w:tcW w:w="2033" w:type="dxa"/>
           </w:tcPr>
           <w:p>
             <w:pPr>
@@ -2818,33 +2030,17 @@
                 <w:lang w:val="es-CO"/>
               </w:rPr>
             </w:pPr>
-            <w:proofErr w:type="spellStart"/>
-            <w:proofErr w:type="gramStart"/>
-            <w:r>
-              <w:rPr>
-                <w:lang w:val="es-CO"/>
-              </w:rPr>
-              <w:t>distinctSymbols</w:t>
-            </w:r>
-            <w:proofErr w:type="spellEnd"/>
-            <w:r>
-              <w:rPr>
-                <w:lang w:val="es-CO"/>
-              </w:rPr>
-              <w:t>(</w:t>
-            </w:r>
-            <w:proofErr w:type="gramEnd"/>
-            <w:r>
-              <w:rPr>
-                <w:lang w:val="es-CO"/>
-              </w:rPr>
-              <w:t>)</w:t>
+            <w:r>
+              <w:rPr>
+                <w:lang w:val="es-CO"/>
+              </w:rPr>
+              <w:t>Configuration()</w:t>
             </w:r>
           </w:p>
         </w:tc>
         <w:tc>
           <w:tcPr>
-            <w:tcW w:w="6580" w:type="dxa"/>
+            <w:tcW w:w="6516" w:type="dxa"/>
           </w:tcPr>
           <w:p>
             <w:pPr>
@@ -2852,27 +2048,23 @@
                 <w:lang w:val="es-CO"/>
               </w:rPr>
             </w:pPr>
-            <w:proofErr w:type="spellStart"/>
-            <w:proofErr w:type="gramStart"/>
-            <w:r>
-              <w:rPr>
-                <w:lang w:val="es-CO"/>
-              </w:rPr>
-              <w:t>shouldGiveCorrectDistinctSymbolsNumber</w:t>
-            </w:r>
-            <w:proofErr w:type="spellEnd"/>
-            <w:r>
-              <w:rPr>
-                <w:lang w:val="es-CO"/>
-              </w:rPr>
-              <w:t>(</w:t>
-            </w:r>
-            <w:proofErr w:type="gramEnd"/>
-            <w:r>
-              <w:rPr>
-                <w:lang w:val="es-CO"/>
-              </w:rPr>
-              <w:t>)</w:t>
+            <w:r>
+              <w:rPr>
+                <w:lang w:val="es-CO"/>
+              </w:rPr>
+              <w:t>shouldGiveCorrect</w:t>
+            </w:r>
+            <w:r>
+              <w:rPr>
+                <w:lang w:val="es-CO"/>
+              </w:rPr>
+              <w:t>Current</w:t>
+            </w:r>
+            <w:r>
+              <w:rPr>
+                <w:lang w:val="es-CO"/>
+              </w:rPr>
+              <w:t>Symbols()</w:t>
             </w:r>
           </w:p>
         </w:tc>
@@ -2880,7 +2072,7 @@
       <w:tr>
         <w:tc>
           <w:tcPr>
-            <w:tcW w:w="1969" w:type="dxa"/>
+            <w:tcW w:w="2033" w:type="dxa"/>
           </w:tcPr>
           <w:p>
             <w:pPr>
@@ -2888,33 +2080,17 @@
                 <w:lang w:val="es-CO"/>
               </w:rPr>
             </w:pPr>
-            <w:proofErr w:type="spellStart"/>
-            <w:proofErr w:type="gramStart"/>
-            <w:r>
-              <w:rPr>
-                <w:lang w:val="es-CO"/>
-              </w:rPr>
-              <w:t>Configuration</w:t>
-            </w:r>
-            <w:proofErr w:type="spellEnd"/>
-            <w:r>
-              <w:rPr>
-                <w:lang w:val="es-CO"/>
-              </w:rPr>
-              <w:t>(</w:t>
-            </w:r>
-            <w:proofErr w:type="gramEnd"/>
-            <w:r>
-              <w:rPr>
-                <w:lang w:val="es-CO"/>
-              </w:rPr>
-              <w:t>)</w:t>
+            <w:r>
+              <w:rPr>
+                <w:lang w:val="es-CO"/>
+              </w:rPr>
+              <w:t>isJackpot()</w:t>
             </w:r>
           </w:p>
         </w:tc>
         <w:tc>
           <w:tcPr>
-            <w:tcW w:w="6580" w:type="dxa"/>
+            <w:tcW w:w="6516" w:type="dxa"/>
           </w:tcPr>
           <w:p>
             <w:pPr>
@@ -2922,126 +2098,30 @@
                 <w:lang w:val="es-CO"/>
               </w:rPr>
             </w:pPr>
-            <w:proofErr w:type="spellStart"/>
-            <w:proofErr w:type="gramStart"/>
-            <w:r>
-              <w:rPr>
-                <w:lang w:val="es-CO"/>
-              </w:rPr>
-              <w:t>shouldGiveCorrectActualSymbols</w:t>
-            </w:r>
-            <w:proofErr w:type="spellEnd"/>
-            <w:r>
-              <w:rPr>
-                <w:lang w:val="es-CO"/>
-              </w:rPr>
-              <w:t>(</w:t>
-            </w:r>
-            <w:proofErr w:type="gramEnd"/>
-            <w:r>
-              <w:rPr>
-                <w:lang w:val="es-CO"/>
-              </w:rPr>
-              <w:t>)</w:t>
-            </w:r>
-          </w:p>
-        </w:tc>
-      </w:tr>
-      <w:tr>
-        <w:tc>
-          <w:tcPr>
-            <w:tcW w:w="1969" w:type="dxa"/>
-          </w:tcPr>
+            <w:r>
+              <w:rPr>
+                <w:lang w:val="es-CO"/>
+              </w:rPr>
+              <w:t>shouldBeJackpotIfAllSymbolsAreEquals()</w:t>
+            </w:r>
+          </w:p>
           <w:p>
             <w:pPr>
               <w:rPr>
                 <w:lang w:val="es-CO"/>
               </w:rPr>
             </w:pPr>
-            <w:proofErr w:type="spellStart"/>
-            <w:proofErr w:type="gramStart"/>
-            <w:r>
-              <w:rPr>
-                <w:lang w:val="es-CO"/>
-              </w:rPr>
-              <w:t>isJackpot</w:t>
-            </w:r>
-            <w:proofErr w:type="spellEnd"/>
-            <w:r>
-              <w:rPr>
-                <w:lang w:val="es-CO"/>
-              </w:rPr>
-              <w:t>(</w:t>
-            </w:r>
-            <w:proofErr w:type="gramEnd"/>
-            <w:r>
-              <w:rPr>
-                <w:lang w:val="es-CO"/>
-              </w:rPr>
-              <w:t>)</w:t>
-            </w:r>
-          </w:p>
-        </w:tc>
-        <w:tc>
-          <w:tcPr>
-            <w:tcW w:w="6580" w:type="dxa"/>
-          </w:tcPr>
-          <w:p>
-            <w:pPr>
-              <w:rPr>
-                <w:lang w:val="es-CO"/>
-              </w:rPr>
-            </w:pPr>
-            <w:proofErr w:type="spellStart"/>
-            <w:proofErr w:type="gramStart"/>
-            <w:r>
-              <w:rPr>
-                <w:lang w:val="es-CO"/>
-              </w:rPr>
-              <w:t>shouldBeJackpotIfAllSymbolsAreEquals</w:t>
-            </w:r>
-            <w:proofErr w:type="spellEnd"/>
-            <w:r>
-              <w:rPr>
-                <w:lang w:val="es-CO"/>
-              </w:rPr>
-              <w:t>(</w:t>
-            </w:r>
-            <w:proofErr w:type="gramEnd"/>
-            <w:r>
-              <w:rPr>
-                <w:lang w:val="es-CO"/>
-              </w:rPr>
-              <w:t>)</w:t>
-            </w:r>
-          </w:p>
-          <w:p>
-            <w:pPr>
-              <w:rPr>
-                <w:lang w:val="es-CO"/>
-              </w:rPr>
-            </w:pPr>
-            <w:proofErr w:type="spellStart"/>
-            <w:proofErr w:type="gramStart"/>
             <w:r>
               <w:rPr>
                 <w:lang w:val="es-CO"/>
               </w:rPr>
               <w:t>shouldNotBeJackpotIfAtLeastTwoSymbolsAreDifferent</w:t>
             </w:r>
-            <w:proofErr w:type="spellEnd"/>
-            <w:r>
-              <w:rPr>
-                <w:lang w:val="es-CO"/>
-              </w:rPr>
-              <w:t>(</w:t>
-            </w:r>
-            <w:proofErr w:type="gramEnd"/>
-            <w:r>
-              <w:rPr>
-                <w:lang w:val="es-CO"/>
-              </w:rPr>
-              <w:t>)</w:t>
+            <w:r>
+              <w:rPr>
+                <w:lang w:val="es-CO"/>
+              </w:rPr>
+              <w:t>()</w:t>
             </w:r>
           </w:p>
         </w:tc>
@@ -3087,88 +2167,30 @@
           <w:bCs/>
         </w:rPr>
       </w:pPr>
-      <w:proofErr w:type="spellStart"/>
-      <w:proofErr w:type="gramStart"/>
       <w:r>
         <w:rPr>
           <w:b/>
           <w:bCs/>
         </w:rPr>
-        <w:t>addWheel</w:t>
-      </w:r>
-      <w:proofErr w:type="spellEnd"/>
-      <w:r>
-        <w:rPr>
-          <w:b/>
-          <w:bCs/>
-        </w:rPr>
-        <w:t>(</w:t>
-      </w:r>
-      <w:proofErr w:type="spellStart"/>
-      <w:proofErr w:type="gramEnd"/>
-      <w:r>
-        <w:rPr>
-          <w:b/>
-          <w:bCs/>
-        </w:rPr>
-        <w:t>pos</w:t>
-      </w:r>
-      <w:proofErr w:type="spellEnd"/>
-      <w:r>
-        <w:rPr>
-          <w:b/>
-          <w:bCs/>
-        </w:rPr>
-        <w:t xml:space="preserve">: </w:t>
-      </w:r>
-      <w:proofErr w:type="spellStart"/>
-      <w:r>
-        <w:rPr>
-          <w:b/>
-          <w:bCs/>
-        </w:rPr>
-        <w:t>int</w:t>
-      </w:r>
-      <w:proofErr w:type="spellEnd"/>
-      <w:r>
-        <w:rPr>
-          <w:b/>
-          <w:bCs/>
-        </w:rPr>
-        <w:t xml:space="preserve">): </w:t>
-      </w:r>
-      <w:proofErr w:type="spellStart"/>
-      <w:r>
-        <w:rPr>
-          <w:b/>
-          <w:bCs/>
-        </w:rPr>
-        <w:t>void</w:t>
-      </w:r>
-      <w:proofErr w:type="spellEnd"/>
-    </w:p>
-    <w:p>
-      <w:pPr>
-        <w:pStyle w:val="Prrafodelista"/>
-      </w:pPr>
-      <w:r>
-        <w:t xml:space="preserve">Encontramos 3 </w:t>
-      </w:r>
-      <w:proofErr w:type="spellStart"/>
-      <w:r>
-        <w:t>tests</w:t>
-      </w:r>
-      <w:proofErr w:type="spellEnd"/>
-      <w:r>
-        <w:t>, todos enfocados en ver qué todo funcione si se añade una rueda:</w:t>
-      </w:r>
-    </w:p>
-    <w:p>
-      <w:pPr>
-        <w:pStyle w:val="Prrafodelista"/>
-      </w:pPr>
-      <w:r>
-        <w:lastRenderedPageBreak/>
+        <w:t>addWheel(pos: int): void</w:t>
+      </w:r>
+    </w:p>
+    <w:p>
+      <w:pPr>
+        <w:pStyle w:val="Prrafodelista"/>
+      </w:pPr>
+      <w:r>
+        <w:t>Encontramos 3 tests, todos enfocados en ver qué todo funcione si se añade una rueda:</w:t>
+      </w:r>
+    </w:p>
+    <w:p>
+      <w:pPr>
+        <w:pStyle w:val="Prrafodelista"/>
+      </w:pPr>
+      <w:r>
+        <w:rPr>
+          <w:noProof/>
+        </w:rPr>
         <w:drawing>
           <wp:inline distT="0" distB="0" distL="0" distR="0" wp14:anchorId="5013DB6F" wp14:editId="1F61E58B">
             <wp:extent cx="5612130" cy="3115310"/>
@@ -3211,6 +2233,9 @@
         <w:pStyle w:val="Prrafodelista"/>
       </w:pPr>
       <w:r>
+        <w:rPr>
+          <w:noProof/>
+        </w:rPr>
         <w:lastRenderedPageBreak/>
         <w:drawing>
           <wp:inline distT="0" distB="0" distL="0" distR="0" wp14:anchorId="4505BE78" wp14:editId="0868ED0B">
@@ -3261,87 +2286,30 @@
           <w:bCs/>
         </w:rPr>
       </w:pPr>
-      <w:proofErr w:type="spellStart"/>
-      <w:proofErr w:type="gramStart"/>
       <w:r>
         <w:rPr>
           <w:b/>
           <w:bCs/>
         </w:rPr>
-        <w:t>delWheel</w:t>
-      </w:r>
-      <w:proofErr w:type="spellEnd"/>
-      <w:r>
-        <w:rPr>
-          <w:b/>
-          <w:bCs/>
-        </w:rPr>
-        <w:t>(</w:t>
-      </w:r>
-      <w:proofErr w:type="spellStart"/>
-      <w:proofErr w:type="gramEnd"/>
-      <w:r>
-        <w:rPr>
-          <w:b/>
-          <w:bCs/>
-        </w:rPr>
-        <w:t>pos</w:t>
-      </w:r>
-      <w:proofErr w:type="spellEnd"/>
-      <w:r>
-        <w:rPr>
-          <w:b/>
-          <w:bCs/>
-        </w:rPr>
-        <w:t xml:space="preserve">: </w:t>
-      </w:r>
-      <w:proofErr w:type="spellStart"/>
-      <w:r>
-        <w:rPr>
-          <w:b/>
-          <w:bCs/>
-        </w:rPr>
-        <w:t>int</w:t>
-      </w:r>
-      <w:proofErr w:type="spellEnd"/>
-      <w:r>
-        <w:rPr>
-          <w:b/>
-          <w:bCs/>
-        </w:rPr>
-        <w:t xml:space="preserve">): </w:t>
-      </w:r>
-      <w:proofErr w:type="spellStart"/>
-      <w:r>
-        <w:rPr>
-          <w:b/>
-          <w:bCs/>
-        </w:rPr>
-        <w:t>void</w:t>
-      </w:r>
-      <w:proofErr w:type="spellEnd"/>
-    </w:p>
-    <w:p>
-      <w:pPr>
-        <w:pStyle w:val="Prrafodelista"/>
-      </w:pPr>
-      <w:r>
-        <w:t xml:space="preserve">Encontramos estos 3 </w:t>
-      </w:r>
-      <w:proofErr w:type="spellStart"/>
-      <w:r>
-        <w:t>tests</w:t>
-      </w:r>
-      <w:proofErr w:type="spellEnd"/>
-      <w:r>
-        <w:t xml:space="preserve"> enfocados en ver si se quita una rueda</w:t>
-      </w:r>
-    </w:p>
-    <w:p>
-      <w:pPr>
-        <w:pStyle w:val="Prrafodelista"/>
-      </w:pPr>
-      <w:r>
+        <w:t>delWheel(pos: int): void</w:t>
+      </w:r>
+    </w:p>
+    <w:p>
+      <w:pPr>
+        <w:pStyle w:val="Prrafodelista"/>
+      </w:pPr>
+      <w:r>
+        <w:t>Encontramos estos 3 tests enfocados en ver si se quita una rueda</w:t>
+      </w:r>
+    </w:p>
+    <w:p>
+      <w:pPr>
+        <w:pStyle w:val="Prrafodelista"/>
+      </w:pPr>
+      <w:r>
+        <w:rPr>
+          <w:noProof/>
+        </w:rPr>
         <w:lastRenderedPageBreak/>
         <w:drawing>
           <wp:inline distT="0" distB="0" distL="0" distR="0" wp14:anchorId="3144CC26" wp14:editId="4427D7F3">
@@ -3385,6 +2353,9 @@
         <w:pStyle w:val="Prrafodelista"/>
       </w:pPr>
       <w:r>
+        <w:rPr>
+          <w:noProof/>
+        </w:rPr>
         <w:drawing>
           <wp:inline distT="0" distB="0" distL="0" distR="0" wp14:anchorId="69005F64" wp14:editId="4E5863CE">
             <wp:extent cx="4610743" cy="4706007"/>
@@ -3435,7 +2406,6 @@
           <w:lang w:val="en-US"/>
         </w:rPr>
       </w:pPr>
-      <w:proofErr w:type="gramStart"/>
       <w:r>
         <w:rPr>
           <w:b/>
@@ -3444,47 +2414,28 @@
         </w:rPr>
         <w:t>Swap(</w:t>
       </w:r>
-      <w:proofErr w:type="gramEnd"/>
       <w:r>
         <w:rPr>
           <w:b/>
           <w:bCs/>
           <w:lang w:val="en-US"/>
         </w:rPr>
-        <w:t>wheel 1: int, wheel</w:t>
-      </w:r>
-      <w:proofErr w:type="gramStart"/>
+        <w:t>wheel 1: int, wheel2 : int</w:t>
+      </w:r>
       <w:r>
         <w:rPr>
           <w:b/>
           <w:bCs/>
           <w:lang w:val="en-US"/>
         </w:rPr>
-        <w:t>2 :</w:t>
-      </w:r>
-      <w:proofErr w:type="gramEnd"/>
+        <w:t>):</w:t>
+      </w:r>
       <w:r>
         <w:rPr>
           <w:b/>
           <w:bCs/>
           <w:lang w:val="en-US"/>
         </w:rPr>
-        <w:t xml:space="preserve"> int</w:t>
-      </w:r>
-      <w:r>
-        <w:rPr>
-          <w:b/>
-          <w:bCs/>
-          <w:lang w:val="en-US"/>
-        </w:rPr>
-        <w:t>):</w:t>
-      </w:r>
-      <w:r>
-        <w:rPr>
-          <w:b/>
-          <w:bCs/>
-          <w:lang w:val="en-US"/>
-        </w:rPr>
         <w:t xml:space="preserve"> void</w:t>
       </w:r>
     </w:p>
@@ -3512,6 +2463,7 @@
       </w:pPr>
       <w:r>
         <w:rPr>
+          <w:noProof/>
           <w:lang w:val="en-US"/>
         </w:rPr>
         <w:drawing>
@@ -3569,30 +2521,20 @@
           <w:lang w:val="en-US"/>
         </w:rPr>
       </w:pPr>
-      <w:proofErr w:type="gramStart"/>
       <w:r>
         <w:rPr>
           <w:b/>
           <w:bCs/>
           <w:lang w:val="en-US"/>
         </w:rPr>
-        <w:t>lock(</w:t>
-      </w:r>
-      <w:proofErr w:type="gramEnd"/>
+        <w:t>lock(wheel: int): void</w:t>
+      </w:r>
       <w:r>
         <w:rPr>
           <w:b/>
           <w:bCs/>
           <w:lang w:val="en-US"/>
         </w:rPr>
-        <w:t>wheel: int): void</w:t>
-      </w:r>
-      <w:r>
-        <w:rPr>
-          <w:b/>
-          <w:bCs/>
-          <w:lang w:val="en-US"/>
-        </w:rPr>
         <w:t xml:space="preserve"> **</w:t>
       </w:r>
     </w:p>
@@ -3618,6 +2560,9 @@
         <w:pStyle w:val="Prrafodelista"/>
       </w:pPr>
       <w:r>
+        <w:rPr>
+          <w:noProof/>
+        </w:rPr>
         <w:drawing>
           <wp:inline distT="0" distB="0" distL="0" distR="0" wp14:anchorId="17DF8D61" wp14:editId="221B7CF1">
             <wp:extent cx="5612130" cy="2409825"/>
@@ -3667,83 +2612,25 @@
           <w:bCs/>
         </w:rPr>
       </w:pPr>
-      <w:proofErr w:type="spellStart"/>
-      <w:proofErr w:type="gramStart"/>
       <w:r>
         <w:rPr>
           <w:b/>
           <w:bCs/>
         </w:rPr>
-        <w:t>unlock</w:t>
-      </w:r>
-      <w:proofErr w:type="spellEnd"/>
-      <w:r>
-        <w:rPr>
-          <w:b/>
-          <w:bCs/>
-        </w:rPr>
-        <w:t>(</w:t>
-      </w:r>
-      <w:proofErr w:type="gramEnd"/>
-      <w:r>
-        <w:rPr>
-          <w:b/>
-          <w:bCs/>
-        </w:rPr>
-        <w:t xml:space="preserve">Wheel: </w:t>
-      </w:r>
-      <w:proofErr w:type="spellStart"/>
-      <w:r>
-        <w:rPr>
-          <w:b/>
-          <w:bCs/>
-        </w:rPr>
-        <w:t>int</w:t>
-      </w:r>
-      <w:proofErr w:type="spellEnd"/>
-      <w:r>
-        <w:rPr>
-          <w:b/>
-          <w:bCs/>
-        </w:rPr>
-        <w:t xml:space="preserve">): </w:t>
-      </w:r>
-      <w:proofErr w:type="spellStart"/>
-      <w:r>
-        <w:rPr>
-          <w:b/>
-          <w:bCs/>
-        </w:rPr>
-        <w:t>void</w:t>
-      </w:r>
-      <w:proofErr w:type="spellEnd"/>
-      <w:r>
-        <w:rPr>
-          <w:b/>
-          <w:bCs/>
-        </w:rPr>
-        <w:t xml:space="preserve"> **</w:t>
-      </w:r>
-    </w:p>
-    <w:p>
-      <w:pPr>
-        <w:pStyle w:val="Prrafodelista"/>
-      </w:pPr>
-    </w:p>
-    <w:p>
-      <w:pPr>
-        <w:pStyle w:val="Prrafodelista"/>
-      </w:pPr>
-      <w:r>
-        <w:t xml:space="preserve">Se define </w:t>
-      </w:r>
-      <w:proofErr w:type="gramStart"/>
-      <w:r>
-        <w:t>una caso</w:t>
-      </w:r>
-      <w:proofErr w:type="gramEnd"/>
-      <w:r>
-        <w:t xml:space="preserve"> de prueba donde primero se bloquea y luego se desbloquea y se trata de cambiar</w:t>
+        <w:t>unlock(Wheel: int): void **</w:t>
+      </w:r>
+    </w:p>
+    <w:p>
+      <w:pPr>
+        <w:pStyle w:val="Prrafodelista"/>
+      </w:pPr>
+    </w:p>
+    <w:p>
+      <w:pPr>
+        <w:pStyle w:val="Prrafodelista"/>
+      </w:pPr>
+      <w:r>
+        <w:t>Se define una caso de prueba donde primero se bloquea y luego se desbloquea y se trata de cambiar</w:t>
       </w:r>
       <w:r>
         <w:t>:</w:t>
@@ -3754,6 +2641,9 @@
         <w:pStyle w:val="Prrafodelista"/>
       </w:pPr>
       <w:r>
+        <w:rPr>
+          <w:noProof/>
+        </w:rPr>
         <w:lastRenderedPageBreak/>
         <w:drawing>
           <wp:inline distT="0" distB="0" distL="0" distR="0" wp14:anchorId="539F7B66" wp14:editId="1CC65CCE">
@@ -3805,53 +2695,13 @@
           <w:lang w:val="en-US"/>
         </w:rPr>
       </w:pPr>
-      <w:proofErr w:type="spellStart"/>
-      <w:proofErr w:type="gramStart"/>
       <w:r>
         <w:rPr>
           <w:b/>
           <w:bCs/>
           <w:lang w:val="en-US"/>
         </w:rPr>
-        <w:t>addSymbol</w:t>
-      </w:r>
-      <w:proofErr w:type="spellEnd"/>
-      <w:r>
-        <w:rPr>
-          <w:b/>
-          <w:bCs/>
-          <w:lang w:val="en-US"/>
-        </w:rPr>
-        <w:t>(</w:t>
-      </w:r>
-      <w:proofErr w:type="gramEnd"/>
-      <w:r>
-        <w:rPr>
-          <w:b/>
-          <w:bCs/>
-          <w:lang w:val="en-US"/>
-        </w:rPr>
-        <w:t xml:space="preserve">pos: int, </w:t>
-      </w:r>
-      <w:proofErr w:type="spellStart"/>
-      <w:proofErr w:type="gramStart"/>
-      <w:r>
-        <w:rPr>
-          <w:b/>
-          <w:bCs/>
-          <w:lang w:val="en-US"/>
-        </w:rPr>
-        <w:t>color:String</w:t>
-      </w:r>
-      <w:proofErr w:type="spellEnd"/>
-      <w:proofErr w:type="gramEnd"/>
-      <w:r>
-        <w:rPr>
-          <w:b/>
-          <w:bCs/>
-          <w:lang w:val="en-US"/>
-        </w:rPr>
-        <w:t>): void</w:t>
+        <w:t>addSymbol(pos: int, color:String): void</w:t>
       </w:r>
     </w:p>
     <w:p>
@@ -3873,6 +2723,9 @@
         <w:pStyle w:val="Prrafodelista"/>
       </w:pPr>
       <w:r>
+        <w:rPr>
+          <w:noProof/>
+        </w:rPr>
         <w:drawing>
           <wp:inline distT="0" distB="0" distL="0" distR="0" wp14:anchorId="2C94E665" wp14:editId="38BB0A4E">
             <wp:extent cx="5612130" cy="4683760"/>
@@ -3915,6 +2768,9 @@
         <w:pStyle w:val="Prrafodelista"/>
       </w:pPr>
       <w:r>
+        <w:rPr>
+          <w:noProof/>
+        </w:rPr>
         <w:lastRenderedPageBreak/>
         <w:drawing>
           <wp:inline distT="0" distB="0" distL="0" distR="0" wp14:anchorId="0E7EF4DC" wp14:editId="0116B671">
@@ -3958,6 +2814,9 @@
         <w:pStyle w:val="Prrafodelista"/>
       </w:pPr>
       <w:r>
+        <w:rPr>
+          <w:noProof/>
+        </w:rPr>
         <w:drawing>
           <wp:inline distT="0" distB="0" distL="0" distR="0" wp14:anchorId="5F83ED0E" wp14:editId="632A1477">
             <wp:extent cx="4620270" cy="5001323"/>
@@ -4007,40 +2866,13 @@
           <w:bCs/>
         </w:rPr>
       </w:pPr>
-      <w:proofErr w:type="spellStart"/>
-      <w:proofErr w:type="gramStart"/>
       <w:r>
         <w:rPr>
           <w:b/>
           <w:bCs/>
         </w:rPr>
-        <w:t>delSymbols</w:t>
-      </w:r>
-      <w:proofErr w:type="spellEnd"/>
-      <w:r>
-        <w:rPr>
-          <w:b/>
-          <w:bCs/>
-        </w:rPr>
-        <w:t>(symbol :</w:t>
-      </w:r>
-      <w:proofErr w:type="gramEnd"/>
-      <w:r>
-        <w:rPr>
-          <w:b/>
-          <w:bCs/>
-        </w:rPr>
-        <w:t xml:space="preserve"> String): </w:t>
-      </w:r>
-      <w:proofErr w:type="spellStart"/>
-      <w:r>
-        <w:rPr>
-          <w:b/>
-          <w:bCs/>
-        </w:rPr>
-        <w:t>void</w:t>
-      </w:r>
-      <w:proofErr w:type="spellEnd"/>
+        <w:t>delSymbols(symbol : String): void</w:t>
+      </w:r>
     </w:p>
     <w:p>
       <w:pPr>
@@ -4061,6 +2893,9 @@
         <w:pStyle w:val="Prrafodelista"/>
       </w:pPr>
       <w:r>
+        <w:rPr>
+          <w:noProof/>
+        </w:rPr>
         <w:lastRenderedPageBreak/>
         <w:drawing>
           <wp:inline distT="0" distB="0" distL="0" distR="0" wp14:anchorId="67BBF165" wp14:editId="6623C59E">
@@ -4109,6 +2944,9 @@
         <w:pStyle w:val="Prrafodelista"/>
       </w:pPr>
       <w:r>
+        <w:rPr>
+          <w:noProof/>
+        </w:rPr>
         <w:drawing>
           <wp:inline distT="0" distB="0" distL="0" distR="0" wp14:anchorId="75BD2CDF" wp14:editId="756F6543">
             <wp:extent cx="4667901" cy="4972744"/>
@@ -4159,8 +2997,6 @@
           <w:lang w:val="en-US"/>
         </w:rPr>
       </w:pPr>
-      <w:proofErr w:type="spellStart"/>
-      <w:proofErr w:type="gramStart"/>
       <w:r>
         <w:rPr>
           <w:b/>
@@ -4168,41 +3004,23 @@
           <w:lang w:val="en-US"/>
         </w:rPr>
         <w:lastRenderedPageBreak/>
-        <w:t>placeSymbol</w:t>
-      </w:r>
-      <w:proofErr w:type="spellEnd"/>
+        <w:t>placeSymbol(Wheel: int, symbol: String)</w:t>
+      </w:r>
       <w:r>
         <w:rPr>
           <w:b/>
           <w:bCs/>
           <w:lang w:val="en-US"/>
         </w:rPr>
-        <w:t>(</w:t>
-      </w:r>
-      <w:proofErr w:type="gramEnd"/>
-      <w:r>
-        <w:rPr>
-          <w:b/>
-          <w:bCs/>
+        <w:t>: void</w:t>
+      </w:r>
+    </w:p>
+    <w:p>
+      <w:pPr>
+        <w:pStyle w:val="Prrafodelista"/>
+        <w:rPr>
           <w:lang w:val="en-US"/>
         </w:rPr>
-        <w:t>Wheel: int, symbol: String)</w:t>
-      </w:r>
-      <w:r>
-        <w:rPr>
-          <w:b/>
-          <w:bCs/>
-          <w:lang w:val="en-US"/>
-        </w:rPr>
-        <w:t>: void</w:t>
-      </w:r>
-    </w:p>
-    <w:p>
-      <w:pPr>
-        <w:pStyle w:val="Prrafodelista"/>
-        <w:rPr>
-          <w:lang w:val="en-US"/>
-        </w:rPr>
       </w:pPr>
     </w:p>
     <w:p>
@@ -4221,6 +3039,9 @@
         <w:pStyle w:val="Prrafodelista"/>
       </w:pPr>
       <w:r>
+        <w:rPr>
+          <w:noProof/>
+        </w:rPr>
         <w:drawing>
           <wp:inline distT="0" distB="0" distL="0" distR="0" wp14:anchorId="678BBA10" wp14:editId="4DF5199D">
             <wp:extent cx="5612130" cy="2206625"/>
@@ -4263,6 +3084,9 @@
         <w:pStyle w:val="Prrafodelista"/>
       </w:pPr>
       <w:r>
+        <w:rPr>
+          <w:noProof/>
+        </w:rPr>
         <w:lastRenderedPageBreak/>
         <w:drawing>
           <wp:inline distT="0" distB="0" distL="0" distR="0" wp14:anchorId="62AA7D0A" wp14:editId="418BD91A">
@@ -4309,47 +3133,13 @@
           <w:bCs/>
         </w:rPr>
       </w:pPr>
-      <w:proofErr w:type="gramStart"/>
       <w:r>
         <w:rPr>
           <w:b/>
           <w:bCs/>
         </w:rPr>
-        <w:t>Spin(</w:t>
-      </w:r>
-      <w:proofErr w:type="gramEnd"/>
-      <w:r>
-        <w:rPr>
-          <w:b/>
-          <w:bCs/>
-        </w:rPr>
-        <w:t xml:space="preserve">Wheel: </w:t>
-      </w:r>
-      <w:proofErr w:type="spellStart"/>
-      <w:r>
-        <w:rPr>
-          <w:b/>
-          <w:bCs/>
-        </w:rPr>
-        <w:t>int</w:t>
-      </w:r>
-      <w:proofErr w:type="spellEnd"/>
-      <w:r>
-        <w:rPr>
-          <w:b/>
-          <w:bCs/>
-        </w:rPr>
-        <w:t xml:space="preserve">): </w:t>
-      </w:r>
-      <w:proofErr w:type="spellStart"/>
-      <w:r>
-        <w:rPr>
-          <w:b/>
-          <w:bCs/>
-        </w:rPr>
-        <w:t>void</w:t>
-      </w:r>
-      <w:proofErr w:type="spellEnd"/>
+        <w:t>Spin(Wheel: int): void</w:t>
+      </w:r>
     </w:p>
     <w:p>
       <w:pPr>
@@ -4367,6 +3157,9 @@
         <w:pStyle w:val="Prrafodelista"/>
       </w:pPr>
       <w:r>
+        <w:rPr>
+          <w:noProof/>
+        </w:rPr>
         <w:lastRenderedPageBreak/>
         <w:drawing>
           <wp:inline distT="0" distB="0" distL="0" distR="0" wp14:anchorId="1C57AB93" wp14:editId="506B933A">
@@ -4410,6 +3203,9 @@
         <w:pStyle w:val="Prrafodelista"/>
       </w:pPr>
       <w:r>
+        <w:rPr>
+          <w:noProof/>
+        </w:rPr>
         <w:lastRenderedPageBreak/>
         <w:drawing>
           <wp:inline distT="0" distB="0" distL="0" distR="0" wp14:anchorId="7F5EF6AD" wp14:editId="792A3491">
@@ -4466,7 +3262,6 @@
           <w:lang w:val="en-US"/>
         </w:rPr>
       </w:pPr>
-      <w:proofErr w:type="gramStart"/>
       <w:r>
         <w:rPr>
           <w:b/>
@@ -4475,7 +3270,6 @@
         </w:rPr>
         <w:t>spin(</w:t>
       </w:r>
-      <w:proofErr w:type="gramEnd"/>
       <w:r>
         <w:rPr>
           <w:b/>
@@ -4518,6 +3312,7 @@
       </w:pPr>
       <w:r>
         <w:rPr>
+          <w:noProof/>
           <w:lang w:val="en-US"/>
         </w:rPr>
         <w:lastRenderedPageBreak/>
@@ -4567,6 +3362,7 @@
       </w:pPr>
       <w:r>
         <w:rPr>
+          <w:noProof/>
           <w:lang w:val="en-US"/>
         </w:rPr>
         <w:lastRenderedPageBreak/>
@@ -4609,33 +3405,435 @@
     </w:p>
     <w:p/>
     <w:p>
-      <w:proofErr w:type="gramStart"/>
-      <w:r>
-        <w:t>Spin(</w:t>
-      </w:r>
-      <w:proofErr w:type="spellStart"/>
-      <w:r>
-        <w:t>setSymbols</w:t>
-      </w:r>
-      <w:proofErr w:type="spellEnd"/>
-      <w:r>
-        <w:t xml:space="preserve"> :</w:t>
-      </w:r>
-      <w:proofErr w:type="gramEnd"/>
-      <w:r>
-        <w:t xml:space="preserve"> </w:t>
-      </w:r>
-      <w:proofErr w:type="gramStart"/>
-      <w:r>
-        <w:t>String[</w:t>
-      </w:r>
-      <w:proofErr w:type="gramEnd"/>
-      <w:r>
-        <w:t>]): void</w:t>
-      </w:r>
-    </w:p>
-    <w:p/>
-    <w:p/>
+      <w:r>
+        <w:t>Spin(setSymbols : String[]): void</w:t>
+      </w:r>
+      <w:r>
+        <w:t xml:space="preserve"> **</w:t>
+      </w:r>
+    </w:p>
+    <w:p>
+      <w:pPr>
+        <w:rPr>
+          <w:lang w:val="es-CO"/>
+        </w:rPr>
+      </w:pPr>
+      <w:r>
+        <w:rPr>
+          <w:lang w:val="es-CO"/>
+        </w:rPr>
+        <w:t>Se le hicieron dos p</w:t>
+      </w:r>
+      <w:r>
+        <w:rPr>
+          <w:lang w:val="es-CO"/>
+        </w:rPr>
+        <w:t>ruebas:</w:t>
+      </w:r>
+    </w:p>
+    <w:p>
+      <w:r>
+        <w:drawing>
+          <wp:inline distT="0" distB="0" distL="0" distR="0" wp14:anchorId="64D117A1" wp14:editId="76F6A15C">
+            <wp:extent cx="5612130" cy="3077210"/>
+            <wp:effectExtent l="0" t="0" r="7620" b="8890"/>
+            <wp:docPr id="310359139" name="Imagen 1"/>
+            <wp:cNvGraphicFramePr>
+              <a:graphicFrameLocks xmlns:a="http://schemas.openxmlformats.org/drawingml/2006/main" noChangeAspect="1"/>
+            </wp:cNvGraphicFramePr>
+            <a:graphic xmlns:a="http://schemas.openxmlformats.org/drawingml/2006/main">
+              <a:graphicData uri="http://schemas.openxmlformats.org/drawingml/2006/picture">
+                <pic:pic xmlns:pic="http://schemas.openxmlformats.org/drawingml/2006/picture">
+                  <pic:nvPicPr>
+                    <pic:cNvPr id="310359139" name=""/>
+                    <pic:cNvPicPr/>
+                  </pic:nvPicPr>
+                  <pic:blipFill>
+                    <a:blip r:embed="rId29"/>
+                    <a:stretch>
+                      <a:fillRect/>
+                    </a:stretch>
+                  </pic:blipFill>
+                  <pic:spPr>
+                    <a:xfrm>
+                      <a:off x="0" y="0"/>
+                      <a:ext cx="5612130" cy="3077210"/>
+                    </a:xfrm>
+                    <a:prstGeom prst="rect">
+                      <a:avLst/>
+                    </a:prstGeom>
+                  </pic:spPr>
+                </pic:pic>
+              </a:graphicData>
+            </a:graphic>
+          </wp:inline>
+        </w:drawing>
+      </w:r>
+    </w:p>
+    <w:p>
+      <w:r>
+        <w:t>Spin(): void</w:t>
+      </w:r>
+    </w:p>
+    <w:p>
+      <w:pPr>
+        <w:rPr>
+          <w:lang w:val="es-CO"/>
+        </w:rPr>
+      </w:pPr>
+      <w:r>
+        <w:rPr>
+          <w:lang w:val="es-CO"/>
+        </w:rPr>
+        <w:lastRenderedPageBreak/>
+        <w:t>Se le hizo una sola p</w:t>
+      </w:r>
+      <w:r>
+        <w:rPr>
+          <w:lang w:val="es-CO"/>
+        </w:rPr>
+        <w:t>rueba:</w:t>
+      </w:r>
+    </w:p>
+    <w:p>
+      <w:pPr>
+        <w:rPr>
+          <w:lang w:val="es-CO"/>
+        </w:rPr>
+      </w:pPr>
+      <w:r>
+        <w:rPr>
+          <w:lang w:val="es-CO"/>
+        </w:rPr>
+        <w:drawing>
+          <wp:inline distT="0" distB="0" distL="0" distR="0" wp14:anchorId="72D2E02C" wp14:editId="7CAF79F8">
+            <wp:extent cx="5612130" cy="995045"/>
+            <wp:effectExtent l="0" t="0" r="7620" b="0"/>
+            <wp:docPr id="73016598" name="Imagen 1"/>
+            <wp:cNvGraphicFramePr>
+              <a:graphicFrameLocks xmlns:a="http://schemas.openxmlformats.org/drawingml/2006/main" noChangeAspect="1"/>
+            </wp:cNvGraphicFramePr>
+            <a:graphic xmlns:a="http://schemas.openxmlformats.org/drawingml/2006/main">
+              <a:graphicData uri="http://schemas.openxmlformats.org/drawingml/2006/picture">
+                <pic:pic xmlns:pic="http://schemas.openxmlformats.org/drawingml/2006/picture">
+                  <pic:nvPicPr>
+                    <pic:cNvPr id="73016598" name=""/>
+                    <pic:cNvPicPr/>
+                  </pic:nvPicPr>
+                  <pic:blipFill>
+                    <a:blip r:embed="rId30"/>
+                    <a:stretch>
+                      <a:fillRect/>
+                    </a:stretch>
+                  </pic:blipFill>
+                  <pic:spPr>
+                    <a:xfrm>
+                      <a:off x="0" y="0"/>
+                      <a:ext cx="5612130" cy="995045"/>
+                    </a:xfrm>
+                    <a:prstGeom prst="rect">
+                      <a:avLst/>
+                    </a:prstGeom>
+                  </pic:spPr>
+                </pic:pic>
+              </a:graphicData>
+            </a:graphic>
+          </wp:inline>
+        </w:drawing>
+      </w:r>
+    </w:p>
+    <w:p>
+      <w:pPr>
+        <w:rPr>
+          <w:lang w:val="es-CO"/>
+        </w:rPr>
+      </w:pPr>
+      <w:r>
+        <w:rPr>
+          <w:lang w:val="es-CO"/>
+        </w:rPr>
+        <w:drawing>
+          <wp:inline distT="0" distB="0" distL="0" distR="0" wp14:anchorId="36F19F87" wp14:editId="6E81CD64">
+            <wp:extent cx="4686954" cy="4772691"/>
+            <wp:effectExtent l="0" t="0" r="0" b="8890"/>
+            <wp:docPr id="960204853" name="Imagen 1"/>
+            <wp:cNvGraphicFramePr>
+              <a:graphicFrameLocks xmlns:a="http://schemas.openxmlformats.org/drawingml/2006/main" noChangeAspect="1"/>
+            </wp:cNvGraphicFramePr>
+            <a:graphic xmlns:a="http://schemas.openxmlformats.org/drawingml/2006/main">
+              <a:graphicData uri="http://schemas.openxmlformats.org/drawingml/2006/picture">
+                <pic:pic xmlns:pic="http://schemas.openxmlformats.org/drawingml/2006/picture">
+                  <pic:nvPicPr>
+                    <pic:cNvPr id="960204853" name=""/>
+                    <pic:cNvPicPr/>
+                  </pic:nvPicPr>
+                  <pic:blipFill>
+                    <a:blip r:embed="rId31"/>
+                    <a:stretch>
+                      <a:fillRect/>
+                    </a:stretch>
+                  </pic:blipFill>
+                  <pic:spPr>
+                    <a:xfrm>
+                      <a:off x="0" y="0"/>
+                      <a:ext cx="4686954" cy="4772691"/>
+                    </a:xfrm>
+                    <a:prstGeom prst="rect">
+                      <a:avLst/>
+                    </a:prstGeom>
+                  </pic:spPr>
+                </pic:pic>
+              </a:graphicData>
+            </a:graphic>
+          </wp:inline>
+        </w:drawing>
+      </w:r>
+    </w:p>
+    <w:p>
+      <w:pPr>
+        <w:rPr>
+          <w:lang w:val="es-CO"/>
+        </w:rPr>
+      </w:pPr>
+      <w:r>
+        <w:rPr>
+          <w:lang w:val="es-CO"/>
+        </w:rPr>
+        <w:t>distinctSymbols(): int</w:t>
+      </w:r>
+      <w:r>
+        <w:rPr>
+          <w:lang w:val="es-CO"/>
+        </w:rPr>
+        <w:t xml:space="preserve"> **</w:t>
+      </w:r>
+    </w:p>
+    <w:p>
+      <w:pPr>
+        <w:rPr>
+          <w:lang w:val="es-CO"/>
+        </w:rPr>
+      </w:pPr>
+      <w:r>
+        <w:rPr>
+          <w:lang w:val="es-CO"/>
+        </w:rPr>
+        <w:t>Se hace una sola prueba:</w:t>
+      </w:r>
+    </w:p>
+    <w:p>
+      <w:pPr>
+        <w:rPr>
+          <w:lang w:val="es-CO"/>
+        </w:rPr>
+      </w:pPr>
+      <w:r>
+        <w:rPr>
+          <w:lang w:val="es-CO"/>
+        </w:rPr>
+        <w:lastRenderedPageBreak/>
+        <w:drawing>
+          <wp:inline distT="0" distB="0" distL="0" distR="0" wp14:anchorId="2D1CA6C2" wp14:editId="4371A100">
+            <wp:extent cx="5612130" cy="1592580"/>
+            <wp:effectExtent l="0" t="0" r="7620" b="7620"/>
+            <wp:docPr id="1800709647" name="Imagen 1"/>
+            <wp:cNvGraphicFramePr>
+              <a:graphicFrameLocks xmlns:a="http://schemas.openxmlformats.org/drawingml/2006/main" noChangeAspect="1"/>
+            </wp:cNvGraphicFramePr>
+            <a:graphic xmlns:a="http://schemas.openxmlformats.org/drawingml/2006/main">
+              <a:graphicData uri="http://schemas.openxmlformats.org/drawingml/2006/picture">
+                <pic:pic xmlns:pic="http://schemas.openxmlformats.org/drawingml/2006/picture">
+                  <pic:nvPicPr>
+                    <pic:cNvPr id="1800709647" name=""/>
+                    <pic:cNvPicPr/>
+                  </pic:nvPicPr>
+                  <pic:blipFill>
+                    <a:blip r:embed="rId32"/>
+                    <a:stretch>
+                      <a:fillRect/>
+                    </a:stretch>
+                  </pic:blipFill>
+                  <pic:spPr>
+                    <a:xfrm>
+                      <a:off x="0" y="0"/>
+                      <a:ext cx="5612130" cy="1592580"/>
+                    </a:xfrm>
+                    <a:prstGeom prst="rect">
+                      <a:avLst/>
+                    </a:prstGeom>
+                  </pic:spPr>
+                </pic:pic>
+              </a:graphicData>
+            </a:graphic>
+          </wp:inline>
+        </w:drawing>
+      </w:r>
+    </w:p>
+    <w:p>
+      <w:pPr>
+        <w:rPr>
+          <w:lang w:val="es-CO"/>
+        </w:rPr>
+      </w:pPr>
+      <w:r>
+        <w:rPr>
+          <w:lang w:val="es-CO"/>
+        </w:rPr>
+        <w:t>Configuration(): String[]</w:t>
+      </w:r>
+      <w:r>
+        <w:rPr>
+          <w:lang w:val="es-CO"/>
+        </w:rPr>
+        <w:t>**</w:t>
+      </w:r>
+    </w:p>
+    <w:p>
+      <w:pPr>
+        <w:rPr>
+          <w:lang w:val="es-CO"/>
+        </w:rPr>
+      </w:pPr>
+      <w:r>
+        <w:rPr>
+          <w:lang w:val="es-CO"/>
+        </w:rPr>
+        <w:t>Solo se tiene una prueba</w:t>
+      </w:r>
+      <w:r>
+        <w:rPr>
+          <w:lang w:val="es-CO"/>
+        </w:rPr>
+        <w:t>:</w:t>
+      </w:r>
+    </w:p>
+    <w:p>
+      <w:pPr>
+        <w:rPr>
+          <w:lang w:val="es-CO"/>
+        </w:rPr>
+      </w:pPr>
+      <w:r>
+        <w:rPr>
+          <w:lang w:val="es-CO"/>
+        </w:rPr>
+        <w:drawing>
+          <wp:inline distT="0" distB="0" distL="0" distR="0" wp14:anchorId="62E23250" wp14:editId="4A83A7C7">
+            <wp:extent cx="5612130" cy="1482090"/>
+            <wp:effectExtent l="0" t="0" r="7620" b="3810"/>
+            <wp:docPr id="424215372" name="Imagen 1"/>
+            <wp:cNvGraphicFramePr>
+              <a:graphicFrameLocks xmlns:a="http://schemas.openxmlformats.org/drawingml/2006/main" noChangeAspect="1"/>
+            </wp:cNvGraphicFramePr>
+            <a:graphic xmlns:a="http://schemas.openxmlformats.org/drawingml/2006/main">
+              <a:graphicData uri="http://schemas.openxmlformats.org/drawingml/2006/picture">
+                <pic:pic xmlns:pic="http://schemas.openxmlformats.org/drawingml/2006/picture">
+                  <pic:nvPicPr>
+                    <pic:cNvPr id="424215372" name=""/>
+                    <pic:cNvPicPr/>
+                  </pic:nvPicPr>
+                  <pic:blipFill>
+                    <a:blip r:embed="rId33"/>
+                    <a:stretch>
+                      <a:fillRect/>
+                    </a:stretch>
+                  </pic:blipFill>
+                  <pic:spPr>
+                    <a:xfrm>
+                      <a:off x="0" y="0"/>
+                      <a:ext cx="5612130" cy="1482090"/>
+                    </a:xfrm>
+                    <a:prstGeom prst="rect">
+                      <a:avLst/>
+                    </a:prstGeom>
+                  </pic:spPr>
+                </pic:pic>
+              </a:graphicData>
+            </a:graphic>
+          </wp:inline>
+        </w:drawing>
+      </w:r>
+    </w:p>
+    <w:p>
+      <w:pPr>
+        <w:rPr>
+          <w:lang w:val="es-CO"/>
+        </w:rPr>
+      </w:pPr>
+      <w:r>
+        <w:rPr>
+          <w:lang w:val="es-CO"/>
+        </w:rPr>
+        <w:t>isJackpot() boolean</w:t>
+      </w:r>
+    </w:p>
+    <w:p>
+      <w:pPr>
+        <w:rPr>
+          <w:lang w:val="es-CO"/>
+        </w:rPr>
+      </w:pPr>
+      <w:r>
+        <w:rPr>
+          <w:lang w:val="es-CO"/>
+        </w:rPr>
+        <w:t>Se tiene dos pruebas:</w:t>
+      </w:r>
+    </w:p>
+    <w:p>
+      <w:pPr>
+        <w:rPr>
+          <w:lang w:val="es-CO"/>
+        </w:rPr>
+      </w:pPr>
+      <w:r>
+        <w:rPr>
+          <w:lang w:val="es-CO"/>
+        </w:rPr>
+        <w:drawing>
+          <wp:inline distT="0" distB="0" distL="0" distR="0" wp14:anchorId="432CB83A" wp14:editId="4645D12C">
+            <wp:extent cx="5612130" cy="3243580"/>
+            <wp:effectExtent l="0" t="0" r="7620" b="0"/>
+            <wp:docPr id="78492394" name="Imagen 1"/>
+            <wp:cNvGraphicFramePr>
+              <a:graphicFrameLocks xmlns:a="http://schemas.openxmlformats.org/drawingml/2006/main" noChangeAspect="1"/>
+            </wp:cNvGraphicFramePr>
+            <a:graphic xmlns:a="http://schemas.openxmlformats.org/drawingml/2006/main">
+              <a:graphicData uri="http://schemas.openxmlformats.org/drawingml/2006/picture">
+                <pic:pic xmlns:pic="http://schemas.openxmlformats.org/drawingml/2006/picture">
+                  <pic:nvPicPr>
+                    <pic:cNvPr id="78492394" name=""/>
+                    <pic:cNvPicPr/>
+                  </pic:nvPicPr>
+                  <pic:blipFill>
+                    <a:blip r:embed="rId34"/>
+                    <a:stretch>
+                      <a:fillRect/>
+                    </a:stretch>
+                  </pic:blipFill>
+                  <pic:spPr>
+                    <a:xfrm>
+                      <a:off x="0" y="0"/>
+                      <a:ext cx="5612130" cy="3243580"/>
+                    </a:xfrm>
+                    <a:prstGeom prst="rect">
+                      <a:avLst/>
+                    </a:prstGeom>
+                  </pic:spPr>
+                </pic:pic>
+              </a:graphicData>
+            </a:graphic>
+          </wp:inline>
+        </w:drawing>
+      </w:r>
+    </w:p>
+    <w:p>
+      <w:pPr>
+        <w:rPr>
+          <w:lang w:val="es-CO"/>
+        </w:rPr>
+      </w:pPr>
+    </w:p>
     <w:sectPr>
       <w:pgSz w:w="12240" w:h="15840"/>
       <w:pgMar w:top="1417" w:right="1701" w:bottom="1417" w:left="1701" w:header="708" w:footer="708" w:gutter="0"/>

</xml_diff>